<commit_message>
Pindahkan menu unduh ke sidebar, tambah logo Kemenkeu pada sampul, dan tambah empat foto unit usaha BUMDesa
</commit_message>
<xml_diff>
--- a/laporan/Laporan-Studi-Lapangan-Kelompok-II-BUMDesa-Manik-Sedana-Desa-Kutuh.docx
+++ b/laporan/Laporan-Studi-Lapangan-Kelompok-II-BUMDesa-Manik-Sedana-Desa-Kutuh.docx
@@ -4,8 +4,67 @@
   <w:body>
     <w:p>
       <w:pPr>
-        <w:spacing w:after="600"/>
-      </w:pPr>
+        <w:spacing w:after="280"/>
+      </w:pPr>
+    </w:p>
+    <w:p>
+      <w:pPr>
+        <w:spacing w:after="280"/>
+        <w:jc w:val="center"/>
+      </w:pPr>
+      <w:r>
+        <w:rPr>
+          <w:noProof/>
+        </w:rPr>
+        <w:drawing>
+          <wp:inline distT="0" distB="0" distL="0" distR="0" wp14:anchorId="1205C992" wp14:editId="03128E48">
+            <wp:extent cx="1044000" cy="943776"/>
+            <wp:effectExtent l="0" t="0" r="0" b="0"/>
+            <wp:docPr id="1" name="Picture 1"/>
+            <wp:cNvGraphicFramePr>
+              <a:graphicFrameLocks xmlns:a="http://schemas.openxmlformats.org/drawingml/2006/main" noChangeAspect="1"/>
+            </wp:cNvGraphicFramePr>
+            <a:graphic xmlns:a="http://schemas.openxmlformats.org/drawingml/2006/main">
+              <a:graphicData uri="http://schemas.openxmlformats.org/drawingml/2006/picture">
+                <pic:pic xmlns:pic="http://schemas.openxmlformats.org/drawingml/2006/picture">
+                  <pic:nvPicPr>
+                    <pic:cNvPr id="0" name="logo-kemenkeu.png"/>
+                    <pic:cNvPicPr/>
+                  </pic:nvPicPr>
+                  <pic:blipFill>
+                    <a:blip r:embed="rId8"/>
+                    <a:stretch>
+                      <a:fillRect/>
+                    </a:stretch>
+                  </pic:blipFill>
+                  <pic:spPr>
+                    <a:xfrm>
+                      <a:off x="0" y="0"/>
+                      <a:ext cx="1044000" cy="943776"/>
+                    </a:xfrm>
+                    <a:prstGeom prst="rect">
+                      <a:avLst/>
+                    </a:prstGeom>
+                  </pic:spPr>
+                </pic:pic>
+              </a:graphicData>
+            </a:graphic>
+          </wp:inline>
+        </w:drawing>
+      </w:r>
+    </w:p>
+    <w:p>
+      <w:pPr>
+        <w:spacing w:after="320"/>
+        <w:jc w:val="center"/>
+      </w:pPr>
+      <w:r>
+        <w:rPr>
+          <w:b/>
+          <w:color w:val="444A52"/>
+        </w:rPr>
+        <w:t>KEMENTERIAN KEUANGAN REPUBLIK INDONESIA</w:t>
+      </w:r>
     </w:p>
     <w:p>
       <w:pPr>
@@ -58,10 +117,10 @@
           <w:noProof/>
         </w:rPr>
         <w:drawing>
-          <wp:inline distT="0" distB="0" distL="0" distR="0" wp14:anchorId="1A4178F1" wp14:editId="5CC969A0">
-            <wp:extent cx="4860000" cy="2733750"/>
+          <wp:inline distT="0" distB="0" distL="0" distR="0" wp14:anchorId="79E90205" wp14:editId="7AFF7DEA">
+            <wp:extent cx="4500000" cy="2531250"/>
             <wp:effectExtent l="0" t="0" r="0" b="0"/>
-            <wp:docPr id="1" name="Picture 1"/>
+            <wp:docPr id="2" name="Picture 2"/>
             <wp:cNvGraphicFramePr>
               <a:graphicFrameLocks xmlns:a="http://schemas.openxmlformats.org/drawingml/2006/main" noChangeAspect="1"/>
             </wp:cNvGraphicFramePr>
@@ -73,7 +132,7 @@
                     <pic:cNvPicPr/>
                   </pic:nvPicPr>
                   <pic:blipFill>
-                    <a:blip r:embed="rId8"/>
+                    <a:blip r:embed="rId9"/>
                     <a:stretch>
                       <a:fillRect/>
                     </a:stretch>
@@ -81,7 +140,7 @@
                   <pic:spPr>
                     <a:xfrm>
                       <a:off x="0" y="0"/>
-                      <a:ext cx="4860000" cy="2733750"/>
+                      <a:ext cx="4500000" cy="2531250"/>
                     </a:xfrm>
                     <a:prstGeom prst="rect">
                       <a:avLst/>
@@ -1481,10 +1540,10 @@
           <w:noProof/>
         </w:rPr>
         <w:drawing>
-          <wp:inline distT="0" distB="0" distL="0" distR="0" wp14:anchorId="35E6022E" wp14:editId="53EE7D7F">
+          <wp:inline distT="0" distB="0" distL="0" distR="0" wp14:anchorId="368E73C4" wp14:editId="11FC067D">
             <wp:extent cx="4500000" cy="2532857"/>
             <wp:effectExtent l="0" t="0" r="0" b="0"/>
-            <wp:docPr id="2" name="Picture 2"/>
+            <wp:docPr id="3" name="Picture 3"/>
             <wp:cNvGraphicFramePr>
               <a:graphicFrameLocks xmlns:a="http://schemas.openxmlformats.org/drawingml/2006/main" noChangeAspect="1"/>
             </wp:cNvGraphicFramePr>
@@ -1496,7 +1555,7 @@
                     <pic:cNvPicPr/>
                   </pic:nvPicPr>
                   <pic:blipFill>
-                    <a:blip r:embed="rId9"/>
+                    <a:blip r:embed="rId10"/>
                     <a:stretch>
                       <a:fillRect/>
                     </a:stretch>
@@ -1542,10 +1601,10 @@
         </w:rPr>
         <w:lastRenderedPageBreak/>
         <w:drawing>
-          <wp:inline distT="0" distB="0" distL="0" distR="0" wp14:anchorId="7F51425B" wp14:editId="6B6B995D">
+          <wp:inline distT="0" distB="0" distL="0" distR="0" wp14:anchorId="0C91AC8D" wp14:editId="4B95471B">
             <wp:extent cx="2951999" cy="5247998"/>
             <wp:effectExtent l="0" t="0" r="0" b="0"/>
-            <wp:docPr id="3" name="Picture 3"/>
+            <wp:docPr id="4" name="Picture 4"/>
             <wp:cNvGraphicFramePr>
               <a:graphicFrameLocks xmlns:a="http://schemas.openxmlformats.org/drawingml/2006/main" noChangeAspect="1"/>
             </wp:cNvGraphicFramePr>
@@ -1557,7 +1616,7 @@
                     <pic:cNvPicPr/>
                   </pic:nvPicPr>
                   <pic:blipFill>
-                    <a:blip r:embed="rId10"/>
+                    <a:blip r:embed="rId11"/>
                     <a:stretch>
                       <a:fillRect/>
                     </a:stretch>
@@ -1602,10 +1661,10 @@
           <w:noProof/>
         </w:rPr>
         <w:drawing>
-          <wp:inline distT="0" distB="0" distL="0" distR="0" wp14:anchorId="19E76BD0" wp14:editId="5E1FDB1C">
+          <wp:inline distT="0" distB="0" distL="0" distR="0" wp14:anchorId="38D5C541" wp14:editId="7BFD1E69">
             <wp:extent cx="4500000" cy="2531250"/>
             <wp:effectExtent l="0" t="0" r="0" b="0"/>
-            <wp:docPr id="4" name="Picture 4"/>
+            <wp:docPr id="5" name="Picture 5"/>
             <wp:cNvGraphicFramePr>
               <a:graphicFrameLocks xmlns:a="http://schemas.openxmlformats.org/drawingml/2006/main" noChangeAspect="1"/>
             </wp:cNvGraphicFramePr>
@@ -1617,7 +1676,7 @@
                     <pic:cNvPicPr/>
                   </pic:nvPicPr>
                   <pic:blipFill>
-                    <a:blip r:embed="rId11"/>
+                    <a:blip r:embed="rId12"/>
                     <a:stretch>
                       <a:fillRect/>
                     </a:stretch>
@@ -1663,10 +1722,10 @@
         </w:rPr>
         <w:lastRenderedPageBreak/>
         <w:drawing>
-          <wp:inline distT="0" distB="0" distL="0" distR="0" wp14:anchorId="0725A521" wp14:editId="4A3CA24D">
+          <wp:inline distT="0" distB="0" distL="0" distR="0" wp14:anchorId="38848D25" wp14:editId="5027869A">
             <wp:extent cx="4500000" cy="2532857"/>
             <wp:effectExtent l="0" t="0" r="0" b="0"/>
-            <wp:docPr id="5" name="Picture 5"/>
+            <wp:docPr id="6" name="Picture 6"/>
             <wp:cNvGraphicFramePr>
               <a:graphicFrameLocks xmlns:a="http://schemas.openxmlformats.org/drawingml/2006/main" noChangeAspect="1"/>
             </wp:cNvGraphicFramePr>
@@ -1678,7 +1737,7 @@
                     <pic:cNvPicPr/>
                   </pic:nvPicPr>
                   <pic:blipFill>
-                    <a:blip r:embed="rId12"/>
+                    <a:blip r:embed="rId13"/>
                     <a:stretch>
                       <a:fillRect/>
                     </a:stretch>
@@ -1723,10 +1782,10 @@
           <w:noProof/>
         </w:rPr>
         <w:drawing>
-          <wp:inline distT="0" distB="0" distL="0" distR="0" wp14:anchorId="132B5079" wp14:editId="7FBAE607">
+          <wp:inline distT="0" distB="0" distL="0" distR="0" wp14:anchorId="1763AAB3" wp14:editId="659845F4">
             <wp:extent cx="4500000" cy="2531250"/>
             <wp:effectExtent l="0" t="0" r="0" b="0"/>
-            <wp:docPr id="6" name="Picture 6"/>
+            <wp:docPr id="7" name="Picture 7"/>
             <wp:cNvGraphicFramePr>
               <a:graphicFrameLocks xmlns:a="http://schemas.openxmlformats.org/drawingml/2006/main" noChangeAspect="1"/>
             </wp:cNvGraphicFramePr>
@@ -1738,7 +1797,7 @@
                     <pic:cNvPicPr/>
                   </pic:nvPicPr>
                   <pic:blipFill>
-                    <a:blip r:embed="rId13"/>
+                    <a:blip r:embed="rId14"/>
                     <a:stretch>
                       <a:fillRect/>
                     </a:stretch>
@@ -1784,68 +1843,7 @@
         </w:rPr>
         <w:lastRenderedPageBreak/>
         <w:drawing>
-          <wp:inline distT="0" distB="0" distL="0" distR="0" wp14:anchorId="4017A3F6" wp14:editId="65F9F34D">
-            <wp:extent cx="2951999" cy="5247998"/>
-            <wp:effectExtent l="0" t="0" r="0" b="0"/>
-            <wp:docPr id="7" name="Picture 7"/>
-            <wp:cNvGraphicFramePr>
-              <a:graphicFrameLocks xmlns:a="http://schemas.openxmlformats.org/drawingml/2006/main" noChangeAspect="1"/>
-            </wp:cNvGraphicFramePr>
-            <a:graphic xmlns:a="http://schemas.openxmlformats.org/drawingml/2006/main">
-              <a:graphicData uri="http://schemas.openxmlformats.org/drawingml/2006/picture">
-                <pic:pic xmlns:pic="http://schemas.openxmlformats.org/drawingml/2006/picture">
-                  <pic:nvPicPr>
-                    <pic:cNvPr id="0" name="07-ramah-tamah-halaman-kantor.jpg"/>
-                    <pic:cNvPicPr/>
-                  </pic:nvPicPr>
-                  <pic:blipFill>
-                    <a:blip r:embed="rId14"/>
-                    <a:stretch>
-                      <a:fillRect/>
-                    </a:stretch>
-                  </pic:blipFill>
-                  <pic:spPr>
-                    <a:xfrm>
-                      <a:off x="0" y="0"/>
-                      <a:ext cx="2951999" cy="5247998"/>
-                    </a:xfrm>
-                    <a:prstGeom prst="rect">
-                      <a:avLst/>
-                    </a:prstGeom>
-                  </pic:spPr>
-                </pic:pic>
-              </a:graphicData>
-            </a:graphic>
-          </wp:inline>
-        </w:drawing>
-      </w:r>
-    </w:p>
-    <w:p>
-      <w:pPr>
-        <w:spacing w:after="240"/>
-        <w:jc w:val="center"/>
-      </w:pPr>
-      <w:r>
-        <w:rPr>
-          <w:i/>
-          <w:color w:val="444A52"/>
-          <w:sz w:val="18"/>
-        </w:rPr>
-        <w:t>Gambar 6. Ramah tamah peserta di halaman Kantor Perbekel Kutuh</w:t>
-      </w:r>
-    </w:p>
-    <w:p>
-      <w:pPr>
-        <w:spacing w:after="60"/>
-        <w:jc w:val="center"/>
-      </w:pPr>
-      <w:r>
-        <w:rPr>
-          <w:noProof/>
-        </w:rPr>
-        <w:lastRenderedPageBreak/>
-        <w:drawing>
-          <wp:inline distT="0" distB="0" distL="0" distR="0" wp14:anchorId="40F7B022" wp14:editId="792CD60D">
+          <wp:inline distT="0" distB="0" distL="0" distR="0" wp14:anchorId="1DC092EF" wp14:editId="7FD1A6DF">
             <wp:extent cx="2951999" cy="5247998"/>
             <wp:effectExtent l="0" t="0" r="0" b="0"/>
             <wp:docPr id="8" name="Picture 8"/>
@@ -1856,7 +1854,7 @@
               <a:graphicData uri="http://schemas.openxmlformats.org/drawingml/2006/picture">
                 <pic:pic xmlns:pic="http://schemas.openxmlformats.org/drawingml/2006/picture">
                   <pic:nvPicPr>
-                    <pic:cNvPr id="0" name="08-jamuan-makan-siang.jpg"/>
+                    <pic:cNvPr id="0" name="07-ramah-tamah-halaman-kantor.jpg"/>
                     <pic:cNvPicPr/>
                   </pic:nvPicPr>
                   <pic:blipFill>
@@ -1892,7 +1890,7 @@
           <w:color w:val="444A52"/>
           <w:sz w:val="18"/>
         </w:rPr>
-        <w:t>Gambar 7. Jamuan makan siang yang disiapkan tuan rumah bagi rombongan</w:t>
+        <w:t>Gambar 6. Ramah tamah peserta di halaman Kantor Perbekel Kutuh</w:t>
       </w:r>
     </w:p>
     <w:p>
@@ -1906,7 +1904,7 @@
         </w:rPr>
         <w:lastRenderedPageBreak/>
         <w:drawing>
-          <wp:inline distT="0" distB="0" distL="0" distR="0" wp14:anchorId="481C986C" wp14:editId="0C105010">
+          <wp:inline distT="0" distB="0" distL="0" distR="0" wp14:anchorId="28FBC73A" wp14:editId="5E16CC9E">
             <wp:extent cx="2951999" cy="5247998"/>
             <wp:effectExtent l="0" t="0" r="0" b="0"/>
             <wp:docPr id="9" name="Picture 9"/>
@@ -1917,7 +1915,7 @@
               <a:graphicData uri="http://schemas.openxmlformats.org/drawingml/2006/picture">
                 <pic:pic xmlns:pic="http://schemas.openxmlformats.org/drawingml/2006/picture">
                   <pic:nvPicPr>
-                    <pic:cNvPr id="0" name="09-kebersamaan-peserta.jpg"/>
+                    <pic:cNvPr id="0" name="08-jamuan-makan-siang.jpg"/>
                     <pic:cNvPicPr/>
                   </pic:nvPicPr>
                   <pic:blipFill>
@@ -1953,7 +1951,312 @@
           <w:color w:val="444A52"/>
           <w:sz w:val="18"/>
         </w:rPr>
+        <w:t>Gambar 7. Jamuan makan siang yang disiapkan tuan rumah bagi rombongan</w:t>
+      </w:r>
+    </w:p>
+    <w:p>
+      <w:pPr>
+        <w:spacing w:after="60"/>
+        <w:jc w:val="center"/>
+      </w:pPr>
+      <w:r>
+        <w:rPr>
+          <w:noProof/>
+        </w:rPr>
+        <w:lastRenderedPageBreak/>
+        <w:drawing>
+          <wp:inline distT="0" distB="0" distL="0" distR="0" wp14:anchorId="2BB4AD5B" wp14:editId="4D6B3B5F">
+            <wp:extent cx="2951999" cy="5247998"/>
+            <wp:effectExtent l="0" t="0" r="0" b="0"/>
+            <wp:docPr id="10" name="Picture 10"/>
+            <wp:cNvGraphicFramePr>
+              <a:graphicFrameLocks xmlns:a="http://schemas.openxmlformats.org/drawingml/2006/main" noChangeAspect="1"/>
+            </wp:cNvGraphicFramePr>
+            <a:graphic xmlns:a="http://schemas.openxmlformats.org/drawingml/2006/main">
+              <a:graphicData uri="http://schemas.openxmlformats.org/drawingml/2006/picture">
+                <pic:pic xmlns:pic="http://schemas.openxmlformats.org/drawingml/2006/picture">
+                  <pic:nvPicPr>
+                    <pic:cNvPr id="0" name="09-kebersamaan-peserta.jpg"/>
+                    <pic:cNvPicPr/>
+                  </pic:nvPicPr>
+                  <pic:blipFill>
+                    <a:blip r:embed="rId17"/>
+                    <a:stretch>
+                      <a:fillRect/>
+                    </a:stretch>
+                  </pic:blipFill>
+                  <pic:spPr>
+                    <a:xfrm>
+                      <a:off x="0" y="0"/>
+                      <a:ext cx="2951999" cy="5247998"/>
+                    </a:xfrm>
+                    <a:prstGeom prst="rect">
+                      <a:avLst/>
+                    </a:prstGeom>
+                  </pic:spPr>
+                </pic:pic>
+              </a:graphicData>
+            </a:graphic>
+          </wp:inline>
+        </w:drawing>
+      </w:r>
+    </w:p>
+    <w:p>
+      <w:pPr>
+        <w:spacing w:after="240"/>
+        <w:jc w:val="center"/>
+      </w:pPr>
+      <w:r>
+        <w:rPr>
+          <w:i/>
+          <w:color w:val="444A52"/>
+          <w:sz w:val="18"/>
+        </w:rPr>
         <w:t>Gambar 8. Kebersamaan anggota Kelompok II menutup rangkaian kunjungan</w:t>
+      </w:r>
+    </w:p>
+    <w:p>
+      <w:pPr>
+        <w:spacing w:after="60"/>
+        <w:jc w:val="center"/>
+      </w:pPr>
+      <w:r>
+        <w:rPr>
+          <w:noProof/>
+        </w:rPr>
+        <w:lastRenderedPageBreak/>
+        <w:drawing>
+          <wp:inline distT="0" distB="0" distL="0" distR="0" wp14:anchorId="25D19803" wp14:editId="74C15F2A">
+            <wp:extent cx="2951999" cy="5247998"/>
+            <wp:effectExtent l="0" t="0" r="0" b="0"/>
+            <wp:docPr id="11" name="Picture 11"/>
+            <wp:cNvGraphicFramePr>
+              <a:graphicFrameLocks xmlns:a="http://schemas.openxmlformats.org/drawingml/2006/main" noChangeAspect="1"/>
+            </wp:cNvGraphicFramePr>
+            <a:graphic xmlns:a="http://schemas.openxmlformats.org/drawingml/2006/main">
+              <a:graphicData uri="http://schemas.openxmlformats.org/drawingml/2006/picture">
+                <pic:pic xmlns:pic="http://schemas.openxmlformats.org/drawingml/2006/picture">
+                  <pic:nvPicPr>
+                    <pic:cNvPr id="0" name="10-papan-nama-kantor-bumdesa.jpg"/>
+                    <pic:cNvPicPr/>
+                  </pic:nvPicPr>
+                  <pic:blipFill>
+                    <a:blip r:embed="rId18"/>
+                    <a:stretch>
+                      <a:fillRect/>
+                    </a:stretch>
+                  </pic:blipFill>
+                  <pic:spPr>
+                    <a:xfrm>
+                      <a:off x="0" y="0"/>
+                      <a:ext cx="2951999" cy="5247998"/>
+                    </a:xfrm>
+                    <a:prstGeom prst="rect">
+                      <a:avLst/>
+                    </a:prstGeom>
+                  </pic:spPr>
+                </pic:pic>
+              </a:graphicData>
+            </a:graphic>
+          </wp:inline>
+        </w:drawing>
+      </w:r>
+    </w:p>
+    <w:p>
+      <w:pPr>
+        <w:spacing w:after="240"/>
+        <w:jc w:val="center"/>
+      </w:pPr>
+      <w:r>
+        <w:rPr>
+          <w:i/>
+          <w:color w:val="444A52"/>
+          <w:sz w:val="18"/>
+        </w:rPr>
+        <w:t>Gambar 9. Anggota Kelompok II di depan papan nama Kantor BUM Desa Manik Sedana Desa Kutuh</w:t>
+      </w:r>
+    </w:p>
+    <w:p>
+      <w:pPr>
+        <w:spacing w:after="60"/>
+        <w:jc w:val="center"/>
+      </w:pPr>
+      <w:r>
+        <w:rPr>
+          <w:noProof/>
+        </w:rPr>
+        <w:lastRenderedPageBreak/>
+        <w:drawing>
+          <wp:inline distT="0" distB="0" distL="0" distR="0" wp14:anchorId="396CB150" wp14:editId="19DB2900">
+            <wp:extent cx="2951999" cy="6728203"/>
+            <wp:effectExtent l="0" t="0" r="0" b="0"/>
+            <wp:docPr id="12" name="Picture 12"/>
+            <wp:cNvGraphicFramePr>
+              <a:graphicFrameLocks xmlns:a="http://schemas.openxmlformats.org/drawingml/2006/main" noChangeAspect="1"/>
+            </wp:cNvGraphicFramePr>
+            <a:graphic xmlns:a="http://schemas.openxmlformats.org/drawingml/2006/main">
+              <a:graphicData uri="http://schemas.openxmlformats.org/drawingml/2006/picture">
+                <pic:pic xmlns:pic="http://schemas.openxmlformats.org/drawingml/2006/picture">
+                  <pic:nvPicPr>
+                    <pic:cNvPr id="0" name="11-unit-jasa-pengangkutan-sampah.jpg"/>
+                    <pic:cNvPicPr/>
+                  </pic:nvPicPr>
+                  <pic:blipFill>
+                    <a:blip r:embed="rId19"/>
+                    <a:stretch>
+                      <a:fillRect/>
+                    </a:stretch>
+                  </pic:blipFill>
+                  <pic:spPr>
+                    <a:xfrm>
+                      <a:off x="0" y="0"/>
+                      <a:ext cx="2951999" cy="6728203"/>
+                    </a:xfrm>
+                    <a:prstGeom prst="rect">
+                      <a:avLst/>
+                    </a:prstGeom>
+                  </pic:spPr>
+                </pic:pic>
+              </a:graphicData>
+            </a:graphic>
+          </wp:inline>
+        </w:drawing>
+      </w:r>
+    </w:p>
+    <w:p>
+      <w:pPr>
+        <w:spacing w:after="240"/>
+        <w:jc w:val="center"/>
+      </w:pPr>
+      <w:r>
+        <w:rPr>
+          <w:i/>
+          <w:color w:val="444A52"/>
+          <w:sz w:val="18"/>
+        </w:rPr>
+        <w:t>Gambar 10. Media promosi unit usaha jasa pengangkutan sampah BUM Desa Manik Sedana</w:t>
+      </w:r>
+    </w:p>
+    <w:p>
+      <w:pPr>
+        <w:spacing w:after="60"/>
+        <w:jc w:val="center"/>
+      </w:pPr>
+      <w:r>
+        <w:rPr>
+          <w:noProof/>
+        </w:rPr>
+        <w:lastRenderedPageBreak/>
+        <w:drawing>
+          <wp:inline distT="0" distB="0" distL="0" distR="0" wp14:anchorId="07C09DCD" wp14:editId="037268D0">
+            <wp:extent cx="2951999" cy="6986980"/>
+            <wp:effectExtent l="0" t="0" r="0" b="0"/>
+            <wp:docPr id="13" name="Picture 13"/>
+            <wp:cNvGraphicFramePr>
+              <a:graphicFrameLocks xmlns:a="http://schemas.openxmlformats.org/drawingml/2006/main" noChangeAspect="1"/>
+            </wp:cNvGraphicFramePr>
+            <a:graphic xmlns:a="http://schemas.openxmlformats.org/drawingml/2006/main">
+              <a:graphicData uri="http://schemas.openxmlformats.org/drawingml/2006/picture">
+                <pic:pic xmlns:pic="http://schemas.openxmlformats.org/drawingml/2006/picture">
+                  <pic:nvPicPr>
+                    <pic:cNvPr id="0" name="12-unit-toko-grosir-dan-ecer.jpg"/>
+                    <pic:cNvPicPr/>
+                  </pic:nvPicPr>
+                  <pic:blipFill>
+                    <a:blip r:embed="rId20"/>
+                    <a:stretch>
+                      <a:fillRect/>
+                    </a:stretch>
+                  </pic:blipFill>
+                  <pic:spPr>
+                    <a:xfrm>
+                      <a:off x="0" y="0"/>
+                      <a:ext cx="2951999" cy="6986980"/>
+                    </a:xfrm>
+                    <a:prstGeom prst="rect">
+                      <a:avLst/>
+                    </a:prstGeom>
+                  </pic:spPr>
+                </pic:pic>
+              </a:graphicData>
+            </a:graphic>
+          </wp:inline>
+        </w:drawing>
+      </w:r>
+    </w:p>
+    <w:p>
+      <w:pPr>
+        <w:spacing w:after="240"/>
+        <w:jc w:val="center"/>
+      </w:pPr>
+      <w:r>
+        <w:rPr>
+          <w:i/>
+          <w:color w:val="444A52"/>
+          <w:sz w:val="18"/>
+        </w:rPr>
+        <w:t>Gambar 11. Media promosi unit usaha toko grosir dan ecer di Jalan Melang Kaja</w:t>
+      </w:r>
+    </w:p>
+    <w:p>
+      <w:pPr>
+        <w:spacing w:after="60"/>
+        <w:jc w:val="center"/>
+      </w:pPr>
+      <w:r>
+        <w:rPr>
+          <w:noProof/>
+        </w:rPr>
+        <w:lastRenderedPageBreak/>
+        <w:drawing>
+          <wp:inline distT="0" distB="0" distL="0" distR="0" wp14:anchorId="572BB4E6" wp14:editId="42C7C461">
+            <wp:extent cx="2951999" cy="6925511"/>
+            <wp:effectExtent l="0" t="0" r="0" b="0"/>
+            <wp:docPr id="14" name="Picture 14"/>
+            <wp:cNvGraphicFramePr>
+              <a:graphicFrameLocks xmlns:a="http://schemas.openxmlformats.org/drawingml/2006/main" noChangeAspect="1"/>
+            </wp:cNvGraphicFramePr>
+            <a:graphic xmlns:a="http://schemas.openxmlformats.org/drawingml/2006/main">
+              <a:graphicData uri="http://schemas.openxmlformats.org/drawingml/2006/picture">
+                <pic:pic xmlns:pic="http://schemas.openxmlformats.org/drawingml/2006/picture">
+                  <pic:nvPicPr>
+                    <pic:cNvPr id="0" name="13-unit-pancali-spa.jpg"/>
+                    <pic:cNvPicPr/>
+                  </pic:nvPicPr>
+                  <pic:blipFill>
+                    <a:blip r:embed="rId21"/>
+                    <a:stretch>
+                      <a:fillRect/>
+                    </a:stretch>
+                  </pic:blipFill>
+                  <pic:spPr>
+                    <a:xfrm>
+                      <a:off x="0" y="0"/>
+                      <a:ext cx="2951999" cy="6925511"/>
+                    </a:xfrm>
+                    <a:prstGeom prst="rect">
+                      <a:avLst/>
+                    </a:prstGeom>
+                  </pic:spPr>
+                </pic:pic>
+              </a:graphicData>
+            </a:graphic>
+          </wp:inline>
+        </w:drawing>
+      </w:r>
+    </w:p>
+    <w:p>
+      <w:pPr>
+        <w:spacing w:after="240"/>
+        <w:jc w:val="center"/>
+      </w:pPr>
+      <w:r>
+        <w:rPr>
+          <w:i/>
+          <w:color w:val="444A52"/>
+          <w:sz w:val="18"/>
+        </w:rPr>
+        <w:t>Gambar 12. Media promosi unit usaha Pancali Spa di kawasan Pantai Pandawa</w:t>
       </w:r>
     </w:p>
     <w:p>
@@ -1998,7 +2301,7 @@
       <w:r>
         <w:fldChar w:fldCharType="separate"/>
       </w:r>
-      <w:hyperlink w:anchor="_Toc236052771" w:history="1">
+      <w:hyperlink w:anchor="_Toc236053778" w:history="1">
         <w:r>
           <w:rPr>
             <w:rStyle w:val="Hyperlink"/>
@@ -2025,687 +2328,7 @@
             <w:noProof/>
             <w:webHidden/>
           </w:rPr>
-          <w:instrText xml:space="preserve"> PAGEREF _Toc236052771 \h </w:instrText>
-        </w:r>
-        <w:r>
-          <w:rPr>
-            <w:noProof/>
-            <w:webHidden/>
-          </w:rPr>
-        </w:r>
-        <w:r>
-          <w:rPr>
-            <w:noProof/>
-            <w:webHidden/>
-          </w:rPr>
-          <w:fldChar w:fldCharType="separate"/>
-        </w:r>
-        <w:r>
-          <w:rPr>
-            <w:noProof/>
-            <w:webHidden/>
-          </w:rPr>
-          <w:t>11</w:t>
-        </w:r>
-        <w:r>
-          <w:rPr>
-            <w:noProof/>
-            <w:webHidden/>
-          </w:rPr>
-          <w:fldChar w:fldCharType="end"/>
-        </w:r>
-      </w:hyperlink>
-    </w:p>
-    <w:p>
-      <w:pPr>
-        <w:pStyle w:val="TOC2"/>
-        <w:tabs>
-          <w:tab w:val="right" w:leader="dot" w:pos="8778"/>
-        </w:tabs>
-        <w:rPr>
-          <w:noProof/>
-        </w:rPr>
-      </w:pPr>
-      <w:hyperlink w:anchor="_Toc236052772" w:history="1">
-        <w:r>
-          <w:rPr>
-            <w:rStyle w:val="Hyperlink"/>
-            <w:noProof/>
-          </w:rPr>
-          <w:t>A. Gambaran Umum Desa Kutuh</w:t>
-        </w:r>
-        <w:r>
-          <w:rPr>
-            <w:noProof/>
-            <w:webHidden/>
-          </w:rPr>
-          <w:tab/>
-        </w:r>
-        <w:r>
-          <w:rPr>
-            <w:noProof/>
-            <w:webHidden/>
-          </w:rPr>
-          <w:fldChar w:fldCharType="begin"/>
-        </w:r>
-        <w:r>
-          <w:rPr>
-            <w:noProof/>
-            <w:webHidden/>
-          </w:rPr>
-          <w:instrText xml:space="preserve"> PAGEREF _Toc236052772 \h </w:instrText>
-        </w:r>
-        <w:r>
-          <w:rPr>
-            <w:noProof/>
-            <w:webHidden/>
-          </w:rPr>
-        </w:r>
-        <w:r>
-          <w:rPr>
-            <w:noProof/>
-            <w:webHidden/>
-          </w:rPr>
-          <w:fldChar w:fldCharType="separate"/>
-        </w:r>
-        <w:r>
-          <w:rPr>
-            <w:noProof/>
-            <w:webHidden/>
-          </w:rPr>
-          <w:t>11</w:t>
-        </w:r>
-        <w:r>
-          <w:rPr>
-            <w:noProof/>
-            <w:webHidden/>
-          </w:rPr>
-          <w:fldChar w:fldCharType="end"/>
-        </w:r>
-      </w:hyperlink>
-    </w:p>
-    <w:p>
-      <w:pPr>
-        <w:pStyle w:val="TOC2"/>
-        <w:tabs>
-          <w:tab w:val="right" w:leader="dot" w:pos="8778"/>
-        </w:tabs>
-        <w:rPr>
-          <w:noProof/>
-        </w:rPr>
-      </w:pPr>
-      <w:hyperlink w:anchor="_Toc236052773" w:history="1">
-        <w:r>
-          <w:rPr>
-            <w:rStyle w:val="Hyperlink"/>
-            <w:noProof/>
-          </w:rPr>
-          <w:t>B. Sejarah dan Transformasi Ekonomi</w:t>
-        </w:r>
-        <w:r>
-          <w:rPr>
-            <w:noProof/>
-            <w:webHidden/>
-          </w:rPr>
-          <w:tab/>
-        </w:r>
-        <w:r>
-          <w:rPr>
-            <w:noProof/>
-            <w:webHidden/>
-          </w:rPr>
-          <w:fldChar w:fldCharType="begin"/>
-        </w:r>
-        <w:r>
-          <w:rPr>
-            <w:noProof/>
-            <w:webHidden/>
-          </w:rPr>
-          <w:instrText xml:space="preserve"> PAGEREF _Toc236052773 \h </w:instrText>
-        </w:r>
-        <w:r>
-          <w:rPr>
-            <w:noProof/>
-            <w:webHidden/>
-          </w:rPr>
-        </w:r>
-        <w:r>
-          <w:rPr>
-            <w:noProof/>
-            <w:webHidden/>
-          </w:rPr>
-          <w:fldChar w:fldCharType="separate"/>
-        </w:r>
-        <w:r>
-          <w:rPr>
-            <w:noProof/>
-            <w:webHidden/>
-          </w:rPr>
-          <w:t>11</w:t>
-        </w:r>
-        <w:r>
-          <w:rPr>
-            <w:noProof/>
-            <w:webHidden/>
-          </w:rPr>
-          <w:fldChar w:fldCharType="end"/>
-        </w:r>
-      </w:hyperlink>
-    </w:p>
-    <w:p>
-      <w:pPr>
-        <w:pStyle w:val="TOC2"/>
-        <w:tabs>
-          <w:tab w:val="right" w:leader="dot" w:pos="8778"/>
-        </w:tabs>
-        <w:rPr>
-          <w:noProof/>
-        </w:rPr>
-      </w:pPr>
-      <w:hyperlink w:anchor="_Toc236052774" w:history="1">
-        <w:r>
-          <w:rPr>
-            <w:rStyle w:val="Hyperlink"/>
-            <w:noProof/>
-          </w:rPr>
-          <w:t>C. Kelembagaan Ekonomi Desa</w:t>
-        </w:r>
-        <w:r>
-          <w:rPr>
-            <w:noProof/>
-            <w:webHidden/>
-          </w:rPr>
-          <w:tab/>
-        </w:r>
-        <w:r>
-          <w:rPr>
-            <w:noProof/>
-            <w:webHidden/>
-          </w:rPr>
-          <w:fldChar w:fldCharType="begin"/>
-        </w:r>
-        <w:r>
-          <w:rPr>
-            <w:noProof/>
-            <w:webHidden/>
-          </w:rPr>
-          <w:instrText xml:space="preserve"> PAGEREF _Toc236052774 \h </w:instrText>
-        </w:r>
-        <w:r>
-          <w:rPr>
-            <w:noProof/>
-            <w:webHidden/>
-          </w:rPr>
-        </w:r>
-        <w:r>
-          <w:rPr>
-            <w:noProof/>
-            <w:webHidden/>
-          </w:rPr>
-          <w:fldChar w:fldCharType="separate"/>
-        </w:r>
-        <w:r>
-          <w:rPr>
-            <w:noProof/>
-            <w:webHidden/>
-          </w:rPr>
-          <w:t>11</w:t>
-        </w:r>
-        <w:r>
-          <w:rPr>
-            <w:noProof/>
-            <w:webHidden/>
-          </w:rPr>
-          <w:fldChar w:fldCharType="end"/>
-        </w:r>
-      </w:hyperlink>
-    </w:p>
-    <w:p>
-      <w:pPr>
-        <w:pStyle w:val="TOC2"/>
-        <w:tabs>
-          <w:tab w:val="right" w:leader="dot" w:pos="8778"/>
-        </w:tabs>
-        <w:rPr>
-          <w:noProof/>
-        </w:rPr>
-      </w:pPr>
-      <w:hyperlink w:anchor="_Toc236052775" w:history="1">
-        <w:r>
-          <w:rPr>
-            <w:rStyle w:val="Hyperlink"/>
-            <w:noProof/>
-          </w:rPr>
-          <w:t>D. Penyertaan Modal dan Kinerja Keuangan</w:t>
-        </w:r>
-        <w:r>
-          <w:rPr>
-            <w:noProof/>
-            <w:webHidden/>
-          </w:rPr>
-          <w:tab/>
-        </w:r>
-        <w:r>
-          <w:rPr>
-            <w:noProof/>
-            <w:webHidden/>
-          </w:rPr>
-          <w:fldChar w:fldCharType="begin"/>
-        </w:r>
-        <w:r>
-          <w:rPr>
-            <w:noProof/>
-            <w:webHidden/>
-          </w:rPr>
-          <w:instrText xml:space="preserve"> PAGEREF _Toc236052775 \h </w:instrText>
-        </w:r>
-        <w:r>
-          <w:rPr>
-            <w:noProof/>
-            <w:webHidden/>
-          </w:rPr>
-        </w:r>
-        <w:r>
-          <w:rPr>
-            <w:noProof/>
-            <w:webHidden/>
-          </w:rPr>
-          <w:fldChar w:fldCharType="separate"/>
-        </w:r>
-        <w:r>
-          <w:rPr>
-            <w:noProof/>
-            <w:webHidden/>
-          </w:rPr>
-          <w:t>12</w:t>
-        </w:r>
-        <w:r>
-          <w:rPr>
-            <w:noProof/>
-            <w:webHidden/>
-          </w:rPr>
-          <w:fldChar w:fldCharType="end"/>
-        </w:r>
-      </w:hyperlink>
-    </w:p>
-    <w:p>
-      <w:pPr>
-        <w:pStyle w:val="TOC1"/>
-        <w:tabs>
-          <w:tab w:val="right" w:leader="dot" w:pos="8778"/>
-        </w:tabs>
-        <w:rPr>
-          <w:noProof/>
-        </w:rPr>
-      </w:pPr>
-      <w:hyperlink w:anchor="_Toc236052776" w:history="1">
-        <w:r>
-          <w:rPr>
-            <w:rStyle w:val="Hyperlink"/>
-            <w:noProof/>
-          </w:rPr>
-          <w:t>BAB II  INOVASI LOKUS YANG MENGINSPIRASI</w:t>
-        </w:r>
-        <w:r>
-          <w:rPr>
-            <w:noProof/>
-            <w:webHidden/>
-          </w:rPr>
-          <w:tab/>
-        </w:r>
-        <w:r>
-          <w:rPr>
-            <w:noProof/>
-            <w:webHidden/>
-          </w:rPr>
-          <w:fldChar w:fldCharType="begin"/>
-        </w:r>
-        <w:r>
-          <w:rPr>
-            <w:noProof/>
-            <w:webHidden/>
-          </w:rPr>
-          <w:instrText xml:space="preserve"> PAGEREF _Toc236052776 \h </w:instrText>
-        </w:r>
-        <w:r>
-          <w:rPr>
-            <w:noProof/>
-            <w:webHidden/>
-          </w:rPr>
-        </w:r>
-        <w:r>
-          <w:rPr>
-            <w:noProof/>
-            <w:webHidden/>
-          </w:rPr>
-          <w:fldChar w:fldCharType="separate"/>
-        </w:r>
-        <w:r>
-          <w:rPr>
-            <w:noProof/>
-            <w:webHidden/>
-          </w:rPr>
-          <w:t>13</w:t>
-        </w:r>
-        <w:r>
-          <w:rPr>
-            <w:noProof/>
-            <w:webHidden/>
-          </w:rPr>
-          <w:fldChar w:fldCharType="end"/>
-        </w:r>
-      </w:hyperlink>
-    </w:p>
-    <w:p>
-      <w:pPr>
-        <w:pStyle w:val="TOC2"/>
-        <w:tabs>
-          <w:tab w:val="right" w:leader="dot" w:pos="8778"/>
-        </w:tabs>
-        <w:rPr>
-          <w:noProof/>
-        </w:rPr>
-      </w:pPr>
-      <w:hyperlink w:anchor="_Toc236052777" w:history="1">
-        <w:r>
-          <w:rPr>
-            <w:rStyle w:val="Hyperlink"/>
-            <w:noProof/>
-          </w:rPr>
-          <w:t>A. Pemisahan Mandat Dua Badan Usaha Desa</w:t>
-        </w:r>
-        <w:r>
-          <w:rPr>
-            <w:noProof/>
-            <w:webHidden/>
-          </w:rPr>
-          <w:tab/>
-        </w:r>
-        <w:r>
-          <w:rPr>
-            <w:noProof/>
-            <w:webHidden/>
-          </w:rPr>
-          <w:fldChar w:fldCharType="begin"/>
-        </w:r>
-        <w:r>
-          <w:rPr>
-            <w:noProof/>
-            <w:webHidden/>
-          </w:rPr>
-          <w:instrText xml:space="preserve"> PAGEREF _Toc236052777 \h </w:instrText>
-        </w:r>
-        <w:r>
-          <w:rPr>
-            <w:noProof/>
-            <w:webHidden/>
-          </w:rPr>
-        </w:r>
-        <w:r>
-          <w:rPr>
-            <w:noProof/>
-            <w:webHidden/>
-          </w:rPr>
-          <w:fldChar w:fldCharType="separate"/>
-        </w:r>
-        <w:r>
-          <w:rPr>
-            <w:noProof/>
-            <w:webHidden/>
-          </w:rPr>
-          <w:t>13</w:t>
-        </w:r>
-        <w:r>
-          <w:rPr>
-            <w:noProof/>
-            <w:webHidden/>
-          </w:rPr>
-          <w:fldChar w:fldCharType="end"/>
-        </w:r>
-      </w:hyperlink>
-    </w:p>
-    <w:p>
-      <w:pPr>
-        <w:pStyle w:val="TOC2"/>
-        <w:tabs>
-          <w:tab w:val="right" w:leader="dot" w:pos="8778"/>
-        </w:tabs>
-        <w:rPr>
-          <w:noProof/>
-        </w:rPr>
-      </w:pPr>
-      <w:hyperlink w:anchor="_Toc236052778" w:history="1">
-        <w:r>
-          <w:rPr>
-            <w:rStyle w:val="Hyperlink"/>
-            <w:noProof/>
-          </w:rPr>
-          <w:t>B. Business Model Canvas BUMDesa Manik Sedana</w:t>
-        </w:r>
-        <w:r>
-          <w:rPr>
-            <w:noProof/>
-            <w:webHidden/>
-          </w:rPr>
-          <w:tab/>
-        </w:r>
-        <w:r>
-          <w:rPr>
-            <w:noProof/>
-            <w:webHidden/>
-          </w:rPr>
-          <w:fldChar w:fldCharType="begin"/>
-        </w:r>
-        <w:r>
-          <w:rPr>
-            <w:noProof/>
-            <w:webHidden/>
-          </w:rPr>
-          <w:instrText xml:space="preserve"> PAGEREF _Toc236052778 \h </w:instrText>
-        </w:r>
-        <w:r>
-          <w:rPr>
-            <w:noProof/>
-            <w:webHidden/>
-          </w:rPr>
-        </w:r>
-        <w:r>
-          <w:rPr>
-            <w:noProof/>
-            <w:webHidden/>
-          </w:rPr>
-          <w:fldChar w:fldCharType="separate"/>
-        </w:r>
-        <w:r>
-          <w:rPr>
-            <w:noProof/>
-            <w:webHidden/>
-          </w:rPr>
-          <w:t>13</w:t>
-        </w:r>
-        <w:r>
-          <w:rPr>
-            <w:noProof/>
-            <w:webHidden/>
-          </w:rPr>
-          <w:fldChar w:fldCharType="end"/>
-        </w:r>
-      </w:hyperlink>
-    </w:p>
-    <w:p>
-      <w:pPr>
-        <w:pStyle w:val="TOC2"/>
-        <w:tabs>
-          <w:tab w:val="right" w:leader="dot" w:pos="8778"/>
-        </w:tabs>
-        <w:rPr>
-          <w:noProof/>
-        </w:rPr>
-      </w:pPr>
-      <w:hyperlink w:anchor="_Toc236052779" w:history="1">
-        <w:r>
-          <w:rPr>
-            <w:rStyle w:val="Hyperlink"/>
-            <w:noProof/>
-          </w:rPr>
-          <w:t>C. Tata Kelola Persampahan sebagai Konteks Pendukung</w:t>
-        </w:r>
-        <w:r>
-          <w:rPr>
-            <w:noProof/>
-            <w:webHidden/>
-          </w:rPr>
-          <w:tab/>
-        </w:r>
-        <w:r>
-          <w:rPr>
-            <w:noProof/>
-            <w:webHidden/>
-          </w:rPr>
-          <w:fldChar w:fldCharType="begin"/>
-        </w:r>
-        <w:r>
-          <w:rPr>
-            <w:noProof/>
-            <w:webHidden/>
-          </w:rPr>
-          <w:instrText xml:space="preserve"> PAGEREF _Toc236052779 \h </w:instrText>
-        </w:r>
-        <w:r>
-          <w:rPr>
-            <w:noProof/>
-            <w:webHidden/>
-          </w:rPr>
-        </w:r>
-        <w:r>
-          <w:rPr>
-            <w:noProof/>
-            <w:webHidden/>
-          </w:rPr>
-          <w:fldChar w:fldCharType="separate"/>
-        </w:r>
-        <w:r>
-          <w:rPr>
-            <w:noProof/>
-            <w:webHidden/>
-          </w:rPr>
-          <w:t>14</w:t>
-        </w:r>
-        <w:r>
-          <w:rPr>
-            <w:noProof/>
-            <w:webHidden/>
-          </w:rPr>
-          <w:fldChar w:fldCharType="end"/>
-        </w:r>
-      </w:hyperlink>
-    </w:p>
-    <w:p>
-      <w:pPr>
-        <w:pStyle w:val="TOC2"/>
-        <w:tabs>
-          <w:tab w:val="right" w:leader="dot" w:pos="8778"/>
-        </w:tabs>
-        <w:rPr>
-          <w:noProof/>
-        </w:rPr>
-      </w:pPr>
-      <w:hyperlink w:anchor="_Toc236052780" w:history="1">
-        <w:r>
-          <w:rPr>
-            <w:rStyle w:val="Hyperlink"/>
-            <w:noProof/>
-          </w:rPr>
-          <w:t>D. Kepemimpinan Transformatif dan Budaya Antikorupsi</w:t>
-        </w:r>
-        <w:r>
-          <w:rPr>
-            <w:noProof/>
-            <w:webHidden/>
-          </w:rPr>
-          <w:tab/>
-        </w:r>
-        <w:r>
-          <w:rPr>
-            <w:noProof/>
-            <w:webHidden/>
-          </w:rPr>
-          <w:fldChar w:fldCharType="begin"/>
-        </w:r>
-        <w:r>
-          <w:rPr>
-            <w:noProof/>
-            <w:webHidden/>
-          </w:rPr>
-          <w:instrText xml:space="preserve"> PAGEREF _Toc236052780 \h </w:instrText>
-        </w:r>
-        <w:r>
-          <w:rPr>
-            <w:noProof/>
-            <w:webHidden/>
-          </w:rPr>
-        </w:r>
-        <w:r>
-          <w:rPr>
-            <w:noProof/>
-            <w:webHidden/>
-          </w:rPr>
-          <w:fldChar w:fldCharType="separate"/>
-        </w:r>
-        <w:r>
-          <w:rPr>
-            <w:noProof/>
-            <w:webHidden/>
-          </w:rPr>
-          <w:t>14</w:t>
-        </w:r>
-        <w:r>
-          <w:rPr>
-            <w:noProof/>
-            <w:webHidden/>
-          </w:rPr>
-          <w:fldChar w:fldCharType="end"/>
-        </w:r>
-      </w:hyperlink>
-    </w:p>
-    <w:p>
-      <w:pPr>
-        <w:pStyle w:val="TOC1"/>
-        <w:tabs>
-          <w:tab w:val="right" w:leader="dot" w:pos="8778"/>
-        </w:tabs>
-        <w:rPr>
-          <w:noProof/>
-        </w:rPr>
-      </w:pPr>
-      <w:hyperlink w:anchor="_Toc236052781" w:history="1">
-        <w:r>
-          <w:rPr>
-            <w:rStyle w:val="Hyperlink"/>
-            <w:noProof/>
-          </w:rPr>
-          <w:t>BAB III  LESSON LEARNT HASIL STUDI LAPANGAN</w:t>
-        </w:r>
-        <w:r>
-          <w:rPr>
-            <w:noProof/>
-            <w:webHidden/>
-          </w:rPr>
-          <w:tab/>
-        </w:r>
-        <w:r>
-          <w:rPr>
-            <w:noProof/>
-            <w:webHidden/>
-          </w:rPr>
-          <w:fldChar w:fldCharType="begin"/>
-        </w:r>
-        <w:r>
-          <w:rPr>
-            <w:noProof/>
-            <w:webHidden/>
-          </w:rPr>
-          <w:instrText xml:space="preserve"> PAGEREF _Toc236052781 \h </w:instrText>
+          <w:instrText xml:space="preserve"> PAGEREF _Toc236053778 \h </w:instrText>
         </w:r>
         <w:r>
           <w:rPr>
@@ -2738,7 +2361,7 @@
     </w:p>
     <w:p>
       <w:pPr>
-        <w:pStyle w:val="TOC1"/>
+        <w:pStyle w:val="TOC2"/>
         <w:tabs>
           <w:tab w:val="right" w:leader="dot" w:pos="8778"/>
         </w:tabs>
@@ -2746,13 +2369,13 @@
           <w:noProof/>
         </w:rPr>
       </w:pPr>
-      <w:hyperlink w:anchor="_Toc236052782" w:history="1">
+      <w:hyperlink w:anchor="_Toc236053779" w:history="1">
         <w:r>
           <w:rPr>
             <w:rStyle w:val="Hyperlink"/>
             <w:noProof/>
           </w:rPr>
-          <w:t>BAB IV  DIAGNOSA DAN IDE PENYELESAIAN</w:t>
+          <w:t>A. Gambaran Umum Desa Kutuh</w:t>
         </w:r>
         <w:r>
           <w:rPr>
@@ -2773,7 +2396,279 @@
             <w:noProof/>
             <w:webHidden/>
           </w:rPr>
-          <w:instrText xml:space="preserve"> PAGEREF _Toc236052782 \h </w:instrText>
+          <w:instrText xml:space="preserve"> PAGEREF _Toc236053779 \h </w:instrText>
+        </w:r>
+        <w:r>
+          <w:rPr>
+            <w:noProof/>
+            <w:webHidden/>
+          </w:rPr>
+        </w:r>
+        <w:r>
+          <w:rPr>
+            <w:noProof/>
+            <w:webHidden/>
+          </w:rPr>
+          <w:fldChar w:fldCharType="separate"/>
+        </w:r>
+        <w:r>
+          <w:rPr>
+            <w:noProof/>
+            <w:webHidden/>
+          </w:rPr>
+          <w:t>15</w:t>
+        </w:r>
+        <w:r>
+          <w:rPr>
+            <w:noProof/>
+            <w:webHidden/>
+          </w:rPr>
+          <w:fldChar w:fldCharType="end"/>
+        </w:r>
+      </w:hyperlink>
+    </w:p>
+    <w:p>
+      <w:pPr>
+        <w:pStyle w:val="TOC2"/>
+        <w:tabs>
+          <w:tab w:val="right" w:leader="dot" w:pos="8778"/>
+        </w:tabs>
+        <w:rPr>
+          <w:noProof/>
+        </w:rPr>
+      </w:pPr>
+      <w:hyperlink w:anchor="_Toc236053780" w:history="1">
+        <w:r>
+          <w:rPr>
+            <w:rStyle w:val="Hyperlink"/>
+            <w:noProof/>
+          </w:rPr>
+          <w:t>B. Sejarah dan Transformasi Ekonomi</w:t>
+        </w:r>
+        <w:r>
+          <w:rPr>
+            <w:noProof/>
+            <w:webHidden/>
+          </w:rPr>
+          <w:tab/>
+        </w:r>
+        <w:r>
+          <w:rPr>
+            <w:noProof/>
+            <w:webHidden/>
+          </w:rPr>
+          <w:fldChar w:fldCharType="begin"/>
+        </w:r>
+        <w:r>
+          <w:rPr>
+            <w:noProof/>
+            <w:webHidden/>
+          </w:rPr>
+          <w:instrText xml:space="preserve"> PAGEREF _Toc236053780 \h </w:instrText>
+        </w:r>
+        <w:r>
+          <w:rPr>
+            <w:noProof/>
+            <w:webHidden/>
+          </w:rPr>
+        </w:r>
+        <w:r>
+          <w:rPr>
+            <w:noProof/>
+            <w:webHidden/>
+          </w:rPr>
+          <w:fldChar w:fldCharType="separate"/>
+        </w:r>
+        <w:r>
+          <w:rPr>
+            <w:noProof/>
+            <w:webHidden/>
+          </w:rPr>
+          <w:t>15</w:t>
+        </w:r>
+        <w:r>
+          <w:rPr>
+            <w:noProof/>
+            <w:webHidden/>
+          </w:rPr>
+          <w:fldChar w:fldCharType="end"/>
+        </w:r>
+      </w:hyperlink>
+    </w:p>
+    <w:p>
+      <w:pPr>
+        <w:pStyle w:val="TOC2"/>
+        <w:tabs>
+          <w:tab w:val="right" w:leader="dot" w:pos="8778"/>
+        </w:tabs>
+        <w:rPr>
+          <w:noProof/>
+        </w:rPr>
+      </w:pPr>
+      <w:hyperlink w:anchor="_Toc236053781" w:history="1">
+        <w:r>
+          <w:rPr>
+            <w:rStyle w:val="Hyperlink"/>
+            <w:noProof/>
+          </w:rPr>
+          <w:t>C. Kelembagaan Ekonomi Desa</w:t>
+        </w:r>
+        <w:r>
+          <w:rPr>
+            <w:noProof/>
+            <w:webHidden/>
+          </w:rPr>
+          <w:tab/>
+        </w:r>
+        <w:r>
+          <w:rPr>
+            <w:noProof/>
+            <w:webHidden/>
+          </w:rPr>
+          <w:fldChar w:fldCharType="begin"/>
+        </w:r>
+        <w:r>
+          <w:rPr>
+            <w:noProof/>
+            <w:webHidden/>
+          </w:rPr>
+          <w:instrText xml:space="preserve"> PAGEREF _Toc236053781 \h </w:instrText>
+        </w:r>
+        <w:r>
+          <w:rPr>
+            <w:noProof/>
+            <w:webHidden/>
+          </w:rPr>
+        </w:r>
+        <w:r>
+          <w:rPr>
+            <w:noProof/>
+            <w:webHidden/>
+          </w:rPr>
+          <w:fldChar w:fldCharType="separate"/>
+        </w:r>
+        <w:r>
+          <w:rPr>
+            <w:noProof/>
+            <w:webHidden/>
+          </w:rPr>
+          <w:t>15</w:t>
+        </w:r>
+        <w:r>
+          <w:rPr>
+            <w:noProof/>
+            <w:webHidden/>
+          </w:rPr>
+          <w:fldChar w:fldCharType="end"/>
+        </w:r>
+      </w:hyperlink>
+    </w:p>
+    <w:p>
+      <w:pPr>
+        <w:pStyle w:val="TOC2"/>
+        <w:tabs>
+          <w:tab w:val="right" w:leader="dot" w:pos="8778"/>
+        </w:tabs>
+        <w:rPr>
+          <w:noProof/>
+        </w:rPr>
+      </w:pPr>
+      <w:hyperlink w:anchor="_Toc236053782" w:history="1">
+        <w:r>
+          <w:rPr>
+            <w:rStyle w:val="Hyperlink"/>
+            <w:noProof/>
+          </w:rPr>
+          <w:t>D. Penyertaan Modal dan Kinerja Keuangan</w:t>
+        </w:r>
+        <w:r>
+          <w:rPr>
+            <w:noProof/>
+            <w:webHidden/>
+          </w:rPr>
+          <w:tab/>
+        </w:r>
+        <w:r>
+          <w:rPr>
+            <w:noProof/>
+            <w:webHidden/>
+          </w:rPr>
+          <w:fldChar w:fldCharType="begin"/>
+        </w:r>
+        <w:r>
+          <w:rPr>
+            <w:noProof/>
+            <w:webHidden/>
+          </w:rPr>
+          <w:instrText xml:space="preserve"> PAGEREF _Toc236053782 \h </w:instrText>
+        </w:r>
+        <w:r>
+          <w:rPr>
+            <w:noProof/>
+            <w:webHidden/>
+          </w:rPr>
+        </w:r>
+        <w:r>
+          <w:rPr>
+            <w:noProof/>
+            <w:webHidden/>
+          </w:rPr>
+          <w:fldChar w:fldCharType="separate"/>
+        </w:r>
+        <w:r>
+          <w:rPr>
+            <w:noProof/>
+            <w:webHidden/>
+          </w:rPr>
+          <w:t>16</w:t>
+        </w:r>
+        <w:r>
+          <w:rPr>
+            <w:noProof/>
+            <w:webHidden/>
+          </w:rPr>
+          <w:fldChar w:fldCharType="end"/>
+        </w:r>
+      </w:hyperlink>
+    </w:p>
+    <w:p>
+      <w:pPr>
+        <w:pStyle w:val="TOC1"/>
+        <w:tabs>
+          <w:tab w:val="right" w:leader="dot" w:pos="8778"/>
+        </w:tabs>
+        <w:rPr>
+          <w:noProof/>
+        </w:rPr>
+      </w:pPr>
+      <w:hyperlink w:anchor="_Toc236053783" w:history="1">
+        <w:r>
+          <w:rPr>
+            <w:rStyle w:val="Hyperlink"/>
+            <w:noProof/>
+          </w:rPr>
+          <w:t>BAB II  INOVASI LOKUS YANG MENGINSPIRASI</w:t>
+        </w:r>
+        <w:r>
+          <w:rPr>
+            <w:noProof/>
+            <w:webHidden/>
+          </w:rPr>
+          <w:tab/>
+        </w:r>
+        <w:r>
+          <w:rPr>
+            <w:noProof/>
+            <w:webHidden/>
+          </w:rPr>
+          <w:fldChar w:fldCharType="begin"/>
+        </w:r>
+        <w:r>
+          <w:rPr>
+            <w:noProof/>
+            <w:webHidden/>
+          </w:rPr>
+          <w:instrText xml:space="preserve"> PAGEREF _Toc236053783 \h </w:instrText>
         </w:r>
         <w:r>
           <w:rPr>
@@ -2814,13 +2709,13 @@
           <w:noProof/>
         </w:rPr>
       </w:pPr>
-      <w:hyperlink w:anchor="_Toc236052783" w:history="1">
+      <w:hyperlink w:anchor="_Toc236053784" w:history="1">
         <w:r>
           <w:rPr>
             <w:rStyle w:val="Hyperlink"/>
             <w:noProof/>
           </w:rPr>
-          <w:t>A. Pemetaan Kesenjangan Kinerja</w:t>
+          <w:t>A. Pemisahan Mandat Dua Badan Usaha Desa</w:t>
         </w:r>
         <w:r>
           <w:rPr>
@@ -2841,7 +2736,7 @@
             <w:noProof/>
             <w:webHidden/>
           </w:rPr>
-          <w:instrText xml:space="preserve"> PAGEREF _Toc236052783 \h </w:instrText>
+          <w:instrText xml:space="preserve"> PAGEREF _Toc236053784 \h </w:instrText>
         </w:r>
         <w:r>
           <w:rPr>
@@ -2882,13 +2777,13 @@
           <w:noProof/>
         </w:rPr>
       </w:pPr>
-      <w:hyperlink w:anchor="_Toc236052784" w:history="1">
+      <w:hyperlink w:anchor="_Toc236053785" w:history="1">
         <w:r>
           <w:rPr>
             <w:rStyle w:val="Hyperlink"/>
             <w:noProof/>
           </w:rPr>
-          <w:t>B. Rumusan Ide Penyelesaian</w:t>
+          <w:t>B. Business Model Canvas BUMDesa Manik Sedana</w:t>
         </w:r>
         <w:r>
           <w:rPr>
@@ -2909,7 +2804,7 @@
             <w:noProof/>
             <w:webHidden/>
           </w:rPr>
-          <w:instrText xml:space="preserve"> PAGEREF _Toc236052784 \h </w:instrText>
+          <w:instrText xml:space="preserve"> PAGEREF _Toc236053785 \h </w:instrText>
         </w:r>
         <w:r>
           <w:rPr>
@@ -2950,13 +2845,13 @@
           <w:noProof/>
         </w:rPr>
       </w:pPr>
-      <w:hyperlink w:anchor="_Toc236052785" w:history="1">
+      <w:hyperlink w:anchor="_Toc236053786" w:history="1">
         <w:r>
           <w:rPr>
             <w:rStyle w:val="Hyperlink"/>
             <w:noProof/>
           </w:rPr>
-          <w:t>C. Prioritas Tindak Lanjut</w:t>
+          <w:t>C. Profil Tiga Unit Usaha BUMDesa</w:t>
         </w:r>
         <w:r>
           <w:rPr>
@@ -2977,7 +2872,7 @@
             <w:noProof/>
             <w:webHidden/>
           </w:rPr>
-          <w:instrText xml:space="preserve"> PAGEREF _Toc236052785 \h </w:instrText>
+          <w:instrText xml:space="preserve"> PAGEREF _Toc236053786 \h </w:instrText>
         </w:r>
         <w:r>
           <w:rPr>
@@ -3010,7 +2905,7 @@
     </w:p>
     <w:p>
       <w:pPr>
-        <w:pStyle w:val="TOC1"/>
+        <w:pStyle w:val="TOC2"/>
         <w:tabs>
           <w:tab w:val="right" w:leader="dot" w:pos="8778"/>
         </w:tabs>
@@ -3018,13 +2913,13 @@
           <w:noProof/>
         </w:rPr>
       </w:pPr>
-      <w:hyperlink w:anchor="_Toc236052786" w:history="1">
+      <w:hyperlink w:anchor="_Toc236053787" w:history="1">
         <w:r>
           <w:rPr>
             <w:rStyle w:val="Hyperlink"/>
             <w:noProof/>
           </w:rPr>
-          <w:t>BAB V  LAPORAN INDIVIDU</w:t>
+          <w:t>D. Tata Kelola Persampahan sebagai Konteks Pendukung</w:t>
         </w:r>
         <w:r>
           <w:rPr>
@@ -3045,7 +2940,75 @@
             <w:noProof/>
             <w:webHidden/>
           </w:rPr>
-          <w:instrText xml:space="preserve"> PAGEREF _Toc236052786 \h </w:instrText>
+          <w:instrText xml:space="preserve"> PAGEREF _Toc236053787 \h </w:instrText>
+        </w:r>
+        <w:r>
+          <w:rPr>
+            <w:noProof/>
+            <w:webHidden/>
+          </w:rPr>
+        </w:r>
+        <w:r>
+          <w:rPr>
+            <w:noProof/>
+            <w:webHidden/>
+          </w:rPr>
+          <w:fldChar w:fldCharType="separate"/>
+        </w:r>
+        <w:r>
+          <w:rPr>
+            <w:noProof/>
+            <w:webHidden/>
+          </w:rPr>
+          <w:t>18</w:t>
+        </w:r>
+        <w:r>
+          <w:rPr>
+            <w:noProof/>
+            <w:webHidden/>
+          </w:rPr>
+          <w:fldChar w:fldCharType="end"/>
+        </w:r>
+      </w:hyperlink>
+    </w:p>
+    <w:p>
+      <w:pPr>
+        <w:pStyle w:val="TOC2"/>
+        <w:tabs>
+          <w:tab w:val="right" w:leader="dot" w:pos="8778"/>
+        </w:tabs>
+        <w:rPr>
+          <w:noProof/>
+        </w:rPr>
+      </w:pPr>
+      <w:hyperlink w:anchor="_Toc236053788" w:history="1">
+        <w:r>
+          <w:rPr>
+            <w:rStyle w:val="Hyperlink"/>
+            <w:noProof/>
+          </w:rPr>
+          <w:t>E. Kepemimpinan Transformatif dan Budaya Antikorupsi</w:t>
+        </w:r>
+        <w:r>
+          <w:rPr>
+            <w:noProof/>
+            <w:webHidden/>
+          </w:rPr>
+          <w:tab/>
+        </w:r>
+        <w:r>
+          <w:rPr>
+            <w:noProof/>
+            <w:webHidden/>
+          </w:rPr>
+          <w:fldChar w:fldCharType="begin"/>
+        </w:r>
+        <w:r>
+          <w:rPr>
+            <w:noProof/>
+            <w:webHidden/>
+          </w:rPr>
+          <w:instrText xml:space="preserve"> PAGEREF _Toc236053788 \h </w:instrText>
         </w:r>
         <w:r>
           <w:rPr>
@@ -3078,6 +3041,142 @@
     </w:p>
     <w:p>
       <w:pPr>
+        <w:pStyle w:val="TOC1"/>
+        <w:tabs>
+          <w:tab w:val="right" w:leader="dot" w:pos="8778"/>
+        </w:tabs>
+        <w:rPr>
+          <w:noProof/>
+        </w:rPr>
+      </w:pPr>
+      <w:hyperlink w:anchor="_Toc236053789" w:history="1">
+        <w:r>
+          <w:rPr>
+            <w:rStyle w:val="Hyperlink"/>
+            <w:noProof/>
+          </w:rPr>
+          <w:t>BAB III  LESSON LEARNT HASIL STUDI LAPANGAN</w:t>
+        </w:r>
+        <w:r>
+          <w:rPr>
+            <w:noProof/>
+            <w:webHidden/>
+          </w:rPr>
+          <w:tab/>
+        </w:r>
+        <w:r>
+          <w:rPr>
+            <w:noProof/>
+            <w:webHidden/>
+          </w:rPr>
+          <w:fldChar w:fldCharType="begin"/>
+        </w:r>
+        <w:r>
+          <w:rPr>
+            <w:noProof/>
+            <w:webHidden/>
+          </w:rPr>
+          <w:instrText xml:space="preserve"> PAGEREF _Toc236053789 \h </w:instrText>
+        </w:r>
+        <w:r>
+          <w:rPr>
+            <w:noProof/>
+            <w:webHidden/>
+          </w:rPr>
+        </w:r>
+        <w:r>
+          <w:rPr>
+            <w:noProof/>
+            <w:webHidden/>
+          </w:rPr>
+          <w:fldChar w:fldCharType="separate"/>
+        </w:r>
+        <w:r>
+          <w:rPr>
+            <w:noProof/>
+            <w:webHidden/>
+          </w:rPr>
+          <w:t>20</w:t>
+        </w:r>
+        <w:r>
+          <w:rPr>
+            <w:noProof/>
+            <w:webHidden/>
+          </w:rPr>
+          <w:fldChar w:fldCharType="end"/>
+        </w:r>
+      </w:hyperlink>
+    </w:p>
+    <w:p>
+      <w:pPr>
+        <w:pStyle w:val="TOC1"/>
+        <w:tabs>
+          <w:tab w:val="right" w:leader="dot" w:pos="8778"/>
+        </w:tabs>
+        <w:rPr>
+          <w:noProof/>
+        </w:rPr>
+      </w:pPr>
+      <w:hyperlink w:anchor="_Toc236053790" w:history="1">
+        <w:r>
+          <w:rPr>
+            <w:rStyle w:val="Hyperlink"/>
+            <w:noProof/>
+          </w:rPr>
+          <w:t>BAB IV  DIAGNOSA DAN IDE PENYELESAIAN</w:t>
+        </w:r>
+        <w:r>
+          <w:rPr>
+            <w:noProof/>
+            <w:webHidden/>
+          </w:rPr>
+          <w:tab/>
+        </w:r>
+        <w:r>
+          <w:rPr>
+            <w:noProof/>
+            <w:webHidden/>
+          </w:rPr>
+          <w:fldChar w:fldCharType="begin"/>
+        </w:r>
+        <w:r>
+          <w:rPr>
+            <w:noProof/>
+            <w:webHidden/>
+          </w:rPr>
+          <w:instrText xml:space="preserve"> PAGEREF _Toc236053790 \h </w:instrText>
+        </w:r>
+        <w:r>
+          <w:rPr>
+            <w:noProof/>
+            <w:webHidden/>
+          </w:rPr>
+        </w:r>
+        <w:r>
+          <w:rPr>
+            <w:noProof/>
+            <w:webHidden/>
+          </w:rPr>
+          <w:fldChar w:fldCharType="separate"/>
+        </w:r>
+        <w:r>
+          <w:rPr>
+            <w:noProof/>
+            <w:webHidden/>
+          </w:rPr>
+          <w:t>22</w:t>
+        </w:r>
+        <w:r>
+          <w:rPr>
+            <w:noProof/>
+            <w:webHidden/>
+          </w:rPr>
+          <w:fldChar w:fldCharType="end"/>
+        </w:r>
+      </w:hyperlink>
+    </w:p>
+    <w:p>
+      <w:pPr>
         <w:pStyle w:val="TOC2"/>
         <w:tabs>
           <w:tab w:val="right" w:leader="dot" w:pos="8778"/>
@@ -3086,7 +3185,279 @@
           <w:noProof/>
         </w:rPr>
       </w:pPr>
-      <w:hyperlink w:anchor="_Toc236052787" w:history="1">
+      <w:hyperlink w:anchor="_Toc236053791" w:history="1">
+        <w:r>
+          <w:rPr>
+            <w:rStyle w:val="Hyperlink"/>
+            <w:noProof/>
+          </w:rPr>
+          <w:t>A. Pemetaan Kesenjangan Kinerja</w:t>
+        </w:r>
+        <w:r>
+          <w:rPr>
+            <w:noProof/>
+            <w:webHidden/>
+          </w:rPr>
+          <w:tab/>
+        </w:r>
+        <w:r>
+          <w:rPr>
+            <w:noProof/>
+            <w:webHidden/>
+          </w:rPr>
+          <w:fldChar w:fldCharType="begin"/>
+        </w:r>
+        <w:r>
+          <w:rPr>
+            <w:noProof/>
+            <w:webHidden/>
+          </w:rPr>
+          <w:instrText xml:space="preserve"> PAGEREF _Toc236053791 \h </w:instrText>
+        </w:r>
+        <w:r>
+          <w:rPr>
+            <w:noProof/>
+            <w:webHidden/>
+          </w:rPr>
+        </w:r>
+        <w:r>
+          <w:rPr>
+            <w:noProof/>
+            <w:webHidden/>
+          </w:rPr>
+          <w:fldChar w:fldCharType="separate"/>
+        </w:r>
+        <w:r>
+          <w:rPr>
+            <w:noProof/>
+            <w:webHidden/>
+          </w:rPr>
+          <w:t>22</w:t>
+        </w:r>
+        <w:r>
+          <w:rPr>
+            <w:noProof/>
+            <w:webHidden/>
+          </w:rPr>
+          <w:fldChar w:fldCharType="end"/>
+        </w:r>
+      </w:hyperlink>
+    </w:p>
+    <w:p>
+      <w:pPr>
+        <w:pStyle w:val="TOC2"/>
+        <w:tabs>
+          <w:tab w:val="right" w:leader="dot" w:pos="8778"/>
+        </w:tabs>
+        <w:rPr>
+          <w:noProof/>
+        </w:rPr>
+      </w:pPr>
+      <w:hyperlink w:anchor="_Toc236053792" w:history="1">
+        <w:r>
+          <w:rPr>
+            <w:rStyle w:val="Hyperlink"/>
+            <w:noProof/>
+          </w:rPr>
+          <w:t>B. Rumusan Ide Penyelesaian</w:t>
+        </w:r>
+        <w:r>
+          <w:rPr>
+            <w:noProof/>
+            <w:webHidden/>
+          </w:rPr>
+          <w:tab/>
+        </w:r>
+        <w:r>
+          <w:rPr>
+            <w:noProof/>
+            <w:webHidden/>
+          </w:rPr>
+          <w:fldChar w:fldCharType="begin"/>
+        </w:r>
+        <w:r>
+          <w:rPr>
+            <w:noProof/>
+            <w:webHidden/>
+          </w:rPr>
+          <w:instrText xml:space="preserve"> PAGEREF _Toc236053792 \h </w:instrText>
+        </w:r>
+        <w:r>
+          <w:rPr>
+            <w:noProof/>
+            <w:webHidden/>
+          </w:rPr>
+        </w:r>
+        <w:r>
+          <w:rPr>
+            <w:noProof/>
+            <w:webHidden/>
+          </w:rPr>
+          <w:fldChar w:fldCharType="separate"/>
+        </w:r>
+        <w:r>
+          <w:rPr>
+            <w:noProof/>
+            <w:webHidden/>
+          </w:rPr>
+          <w:t>22</w:t>
+        </w:r>
+        <w:r>
+          <w:rPr>
+            <w:noProof/>
+            <w:webHidden/>
+          </w:rPr>
+          <w:fldChar w:fldCharType="end"/>
+        </w:r>
+      </w:hyperlink>
+    </w:p>
+    <w:p>
+      <w:pPr>
+        <w:pStyle w:val="TOC2"/>
+        <w:tabs>
+          <w:tab w:val="right" w:leader="dot" w:pos="8778"/>
+        </w:tabs>
+        <w:rPr>
+          <w:noProof/>
+        </w:rPr>
+      </w:pPr>
+      <w:hyperlink w:anchor="_Toc236053793" w:history="1">
+        <w:r>
+          <w:rPr>
+            <w:rStyle w:val="Hyperlink"/>
+            <w:noProof/>
+          </w:rPr>
+          <w:t>C. Prioritas Tindak Lanjut</w:t>
+        </w:r>
+        <w:r>
+          <w:rPr>
+            <w:noProof/>
+            <w:webHidden/>
+          </w:rPr>
+          <w:tab/>
+        </w:r>
+        <w:r>
+          <w:rPr>
+            <w:noProof/>
+            <w:webHidden/>
+          </w:rPr>
+          <w:fldChar w:fldCharType="begin"/>
+        </w:r>
+        <w:r>
+          <w:rPr>
+            <w:noProof/>
+            <w:webHidden/>
+          </w:rPr>
+          <w:instrText xml:space="preserve"> PAGEREF _Toc236053793 \h </w:instrText>
+        </w:r>
+        <w:r>
+          <w:rPr>
+            <w:noProof/>
+            <w:webHidden/>
+          </w:rPr>
+        </w:r>
+        <w:r>
+          <w:rPr>
+            <w:noProof/>
+            <w:webHidden/>
+          </w:rPr>
+          <w:fldChar w:fldCharType="separate"/>
+        </w:r>
+        <w:r>
+          <w:rPr>
+            <w:noProof/>
+            <w:webHidden/>
+          </w:rPr>
+          <w:t>23</w:t>
+        </w:r>
+        <w:r>
+          <w:rPr>
+            <w:noProof/>
+            <w:webHidden/>
+          </w:rPr>
+          <w:fldChar w:fldCharType="end"/>
+        </w:r>
+      </w:hyperlink>
+    </w:p>
+    <w:p>
+      <w:pPr>
+        <w:pStyle w:val="TOC1"/>
+        <w:tabs>
+          <w:tab w:val="right" w:leader="dot" w:pos="8778"/>
+        </w:tabs>
+        <w:rPr>
+          <w:noProof/>
+        </w:rPr>
+      </w:pPr>
+      <w:hyperlink w:anchor="_Toc236053794" w:history="1">
+        <w:r>
+          <w:rPr>
+            <w:rStyle w:val="Hyperlink"/>
+            <w:noProof/>
+          </w:rPr>
+          <w:t>BAB V  LAPORAN INDIVIDU</w:t>
+        </w:r>
+        <w:r>
+          <w:rPr>
+            <w:noProof/>
+            <w:webHidden/>
+          </w:rPr>
+          <w:tab/>
+        </w:r>
+        <w:r>
+          <w:rPr>
+            <w:noProof/>
+            <w:webHidden/>
+          </w:rPr>
+          <w:fldChar w:fldCharType="begin"/>
+        </w:r>
+        <w:r>
+          <w:rPr>
+            <w:noProof/>
+            <w:webHidden/>
+          </w:rPr>
+          <w:instrText xml:space="preserve"> PAGEREF _Toc236053794 \h </w:instrText>
+        </w:r>
+        <w:r>
+          <w:rPr>
+            <w:noProof/>
+            <w:webHidden/>
+          </w:rPr>
+        </w:r>
+        <w:r>
+          <w:rPr>
+            <w:noProof/>
+            <w:webHidden/>
+          </w:rPr>
+          <w:fldChar w:fldCharType="separate"/>
+        </w:r>
+        <w:r>
+          <w:rPr>
+            <w:noProof/>
+            <w:webHidden/>
+          </w:rPr>
+          <w:t>24</w:t>
+        </w:r>
+        <w:r>
+          <w:rPr>
+            <w:noProof/>
+            <w:webHidden/>
+          </w:rPr>
+          <w:fldChar w:fldCharType="end"/>
+        </w:r>
+      </w:hyperlink>
+    </w:p>
+    <w:p>
+      <w:pPr>
+        <w:pStyle w:val="TOC2"/>
+        <w:tabs>
+          <w:tab w:val="right" w:leader="dot" w:pos="8778"/>
+        </w:tabs>
+        <w:rPr>
+          <w:noProof/>
+        </w:rPr>
+      </w:pPr>
+      <w:hyperlink w:anchor="_Toc236053795" w:history="1">
         <w:r>
           <w:rPr>
             <w:rStyle w:val="Hyperlink"/>
@@ -3113,7 +3484,7 @@
             <w:noProof/>
             <w:webHidden/>
           </w:rPr>
-          <w:instrText xml:space="preserve"> PAGEREF _Toc236052787 \h </w:instrText>
+          <w:instrText xml:space="preserve"> PAGEREF _Toc236053795 \h </w:instrText>
         </w:r>
         <w:r>
           <w:rPr>
@@ -3133,7 +3504,7 @@
             <w:noProof/>
             <w:webHidden/>
           </w:rPr>
-          <w:t>19</w:t>
+          <w:t>24</w:t>
         </w:r>
         <w:r>
           <w:rPr>
@@ -3154,7 +3525,7 @@
           <w:noProof/>
         </w:rPr>
       </w:pPr>
-      <w:hyperlink w:anchor="_Toc236052788" w:history="1">
+      <w:hyperlink w:anchor="_Toc236053796" w:history="1">
         <w:r>
           <w:rPr>
             <w:rStyle w:val="Hyperlink"/>
@@ -3181,7 +3552,7 @@
             <w:noProof/>
             <w:webHidden/>
           </w:rPr>
-          <w:instrText xml:space="preserve"> PAGEREF _Toc236052788 \h </w:instrText>
+          <w:instrText xml:space="preserve"> PAGEREF _Toc236053796 \h </w:instrText>
         </w:r>
         <w:r>
           <w:rPr>
@@ -3201,7 +3572,7 @@
             <w:noProof/>
             <w:webHidden/>
           </w:rPr>
-          <w:t>19</w:t>
+          <w:t>24</w:t>
         </w:r>
         <w:r>
           <w:rPr>
@@ -3222,7 +3593,7 @@
           <w:noProof/>
         </w:rPr>
       </w:pPr>
-      <w:hyperlink w:anchor="_Toc236052789" w:history="1">
+      <w:hyperlink w:anchor="_Toc236053797" w:history="1">
         <w:r>
           <w:rPr>
             <w:rStyle w:val="Hyperlink"/>
@@ -3249,7 +3620,7 @@
             <w:noProof/>
             <w:webHidden/>
           </w:rPr>
-          <w:instrText xml:space="preserve"> PAGEREF _Toc236052789 \h </w:instrText>
+          <w:instrText xml:space="preserve"> PAGEREF _Toc236053797 \h </w:instrText>
         </w:r>
         <w:r>
           <w:rPr>
@@ -3269,7 +3640,7 @@
             <w:noProof/>
             <w:webHidden/>
           </w:rPr>
-          <w:t>21</w:t>
+          <w:t>26</w:t>
         </w:r>
         <w:r>
           <w:rPr>
@@ -3294,7 +3665,7 @@
       <w:pPr>
         <w:pStyle w:val="Heading1"/>
       </w:pPr>
-      <w:bookmarkStart w:id="0" w:name="_Toc236052771"/>
+      <w:bookmarkStart w:id="0" w:name="_Toc236053778"/>
       <w:r>
         <w:rPr>
           <w:rFonts w:ascii="Aptos" w:hAnsi="Aptos"/>
@@ -3308,7 +3679,7 @@
       <w:pPr>
         <w:pStyle w:val="Heading2"/>
       </w:pPr>
-      <w:bookmarkStart w:id="1" w:name="_Toc236052772"/>
+      <w:bookmarkStart w:id="1" w:name="_Toc236053779"/>
       <w:r>
         <w:rPr>
           <w:rFonts w:ascii="Aptos" w:hAnsi="Aptos"/>
@@ -3342,7 +3713,7 @@
       <w:pPr>
         <w:pStyle w:val="Heading2"/>
       </w:pPr>
-      <w:bookmarkStart w:id="2" w:name="_Toc236052773"/>
+      <w:bookmarkStart w:id="2" w:name="_Toc236053780"/>
       <w:r>
         <w:rPr>
           <w:rFonts w:ascii="Aptos" w:hAnsi="Aptos"/>
@@ -3382,7 +3753,7 @@
       <w:pPr>
         <w:pStyle w:val="Heading2"/>
       </w:pPr>
-      <w:bookmarkStart w:id="3" w:name="_Toc236052774"/>
+      <w:bookmarkStart w:id="3" w:name="_Toc236053781"/>
       <w:r>
         <w:rPr>
           <w:rFonts w:ascii="Aptos" w:hAnsi="Aptos"/>
@@ -3829,7 +4200,7 @@
       <w:pPr>
         <w:pStyle w:val="Heading2"/>
       </w:pPr>
-      <w:bookmarkStart w:id="4" w:name="_Toc236052775"/>
+      <w:bookmarkStart w:id="4" w:name="_Toc236053782"/>
       <w:r>
         <w:rPr>
           <w:rFonts w:ascii="Aptos" w:hAnsi="Aptos"/>
@@ -4233,7 +4604,7 @@
       <w:pPr>
         <w:pStyle w:val="Heading1"/>
       </w:pPr>
-      <w:bookmarkStart w:id="5" w:name="_Toc236052776"/>
+      <w:bookmarkStart w:id="5" w:name="_Toc236053783"/>
       <w:r>
         <w:rPr>
           <w:rFonts w:ascii="Aptos" w:hAnsi="Aptos"/>
@@ -4256,7 +4627,7 @@
       <w:pPr>
         <w:pStyle w:val="Heading2"/>
       </w:pPr>
-      <w:bookmarkStart w:id="6" w:name="_Toc236052777"/>
+      <w:bookmarkStart w:id="6" w:name="_Toc236053784"/>
       <w:r>
         <w:rPr>
           <w:rFonts w:ascii="Aptos" w:hAnsi="Aptos"/>
@@ -4278,7 +4649,7 @@
       <w:pPr>
         <w:pStyle w:val="Heading2"/>
       </w:pPr>
-      <w:bookmarkStart w:id="7" w:name="_Toc236052778"/>
+      <w:bookmarkStart w:id="7" w:name="_Toc236053785"/>
       <w:r>
         <w:rPr>
           <w:rFonts w:ascii="Aptos" w:hAnsi="Aptos"/>
@@ -4715,12 +5086,12 @@
       <w:pPr>
         <w:pStyle w:val="Heading2"/>
       </w:pPr>
-      <w:bookmarkStart w:id="8" w:name="_Toc236052779"/>
+      <w:bookmarkStart w:id="8" w:name="_Toc236053786"/>
       <w:r>
         <w:rPr>
           <w:rFonts w:ascii="Aptos" w:hAnsi="Aptos"/>
         </w:rPr>
-        <w:t>C. Tata Kelola Persampahan sebagai Konteks Pendukung</w:t>
+        <w:t>C. Profil Tiga Unit Usaha BUMDesa</w:t>
       </w:r>
       <w:bookmarkEnd w:id="8"/>
     </w:p>
@@ -4730,21 +5101,300 @@
         <w:jc w:val="both"/>
       </w:pPr>
       <w:r>
-        <w:t>Topik persampahan yang menjadi fokus Kelompok I bersinggungan langsung dengan salah satu unit usaha BUMDesa. Alur pengelolaannya berjalan dalam empat tahap, dimulai dari regulasi desa, edukasi di hulu bersama Satgas Sampah dan TP-PKK, pengangkutan terpilah oleh BUMDesa, hingga pengolahan di Tempat Pengolahan Sampah Terpadu Tebo Kauh. Inovasi pendukungnya berupa ekonomi sirkular Tebo Green Loop dan bank sampah Plastic Exchange yang dijalankan TP-PKK sejak 2022.</w:t>
+        <w:t>Ketiga unit usaha BUMDesa Manik Sedana beroperasi dengan identitas, alamat, dan jam layanan yang jelas, sebagaimana tampak pada media promosi resmi yang dihimpun tim saat kunjungan. Kejelasan identitas ini penting karena menunjukkan bahwa unit usaha desa dikelola layaknya usaha profesional, bukan kegiatan sampingan tanpa standar layanan.</w:t>
       </w:r>
     </w:p>
     <w:p>
       <w:pPr>
+        <w:spacing w:before="200" w:after="80"/>
+      </w:pPr>
+      <w:r>
+        <w:rPr>
+          <w:b/>
+          <w:color w:val="1F3A5F"/>
+          <w:sz w:val="20"/>
+        </w:rPr>
+        <w:t>Tabel 4. Profil layanan tiga unit usaha BUMDesa Manik Sedana</w:t>
+      </w:r>
+    </w:p>
+    <w:tbl>
+      <w:tblPr>
+        <w:tblStyle w:val="TableGrid"/>
+        <w:tblW w:w="0" w:type="auto"/>
+        <w:jc w:val="center"/>
+        <w:tblLayout w:type="fixed"/>
+        <w:tblLook w:val="04A0" w:firstRow="1" w:lastRow="0" w:firstColumn="1" w:lastColumn="0" w:noHBand="0" w:noVBand="1"/>
+      </w:tblPr>
+      <w:tblGrid>
+        <w:gridCol w:w="2041"/>
+        <w:gridCol w:w="3515"/>
+        <w:gridCol w:w="3231"/>
+      </w:tblGrid>
+      <w:tr>
+        <w:trPr>
+          <w:jc w:val="center"/>
+        </w:trPr>
+        <w:tc>
+          <w:tcPr>
+            <w:tcW w:w="2041" w:type="dxa"/>
+            <w:shd w:val="clear" w:color="auto" w:fill="1F3A5F"/>
+          </w:tcPr>
+          <w:p>
+            <w:pPr>
+              <w:spacing w:before="40" w:after="40"/>
+            </w:pPr>
+            <w:r>
+              <w:rPr>
+                <w:b/>
+                <w:color w:val="FFFFFF"/>
+                <w:sz w:val="19"/>
+              </w:rPr>
+              <w:t>Unit Usaha</w:t>
+            </w:r>
+          </w:p>
+        </w:tc>
+        <w:tc>
+          <w:tcPr>
+            <w:tcW w:w="3515" w:type="dxa"/>
+            <w:shd w:val="clear" w:color="auto" w:fill="1F3A5F"/>
+          </w:tcPr>
+          <w:p>
+            <w:pPr>
+              <w:spacing w:before="40" w:after="40"/>
+            </w:pPr>
+            <w:r>
+              <w:rPr>
+                <w:b/>
+                <w:color w:val="FFFFFF"/>
+                <w:sz w:val="19"/>
+              </w:rPr>
+              <w:t>Layanan</w:t>
+            </w:r>
+          </w:p>
+        </w:tc>
+        <w:tc>
+          <w:tcPr>
+            <w:tcW w:w="3231" w:type="dxa"/>
+            <w:shd w:val="clear" w:color="auto" w:fill="1F3A5F"/>
+          </w:tcPr>
+          <w:p>
+            <w:pPr>
+              <w:spacing w:before="40" w:after="40"/>
+            </w:pPr>
+            <w:r>
+              <w:rPr>
+                <w:b/>
+                <w:color w:val="FFFFFF"/>
+                <w:sz w:val="19"/>
+              </w:rPr>
+              <w:t>Lokasi dan Jam Operasional</w:t>
+            </w:r>
+          </w:p>
+        </w:tc>
+      </w:tr>
+      <w:tr>
+        <w:trPr>
+          <w:jc w:val="center"/>
+        </w:trPr>
+        <w:tc>
+          <w:tcPr>
+            <w:tcW w:w="2041" w:type="dxa"/>
+          </w:tcPr>
+          <w:p>
+            <w:pPr>
+              <w:spacing w:before="40" w:after="40"/>
+            </w:pPr>
+            <w:r>
+              <w:rPr>
+                <w:sz w:val="19"/>
+              </w:rPr>
+              <w:t>Jasa Pengangkutan Sampah</w:t>
+            </w:r>
+          </w:p>
+        </w:tc>
+        <w:tc>
+          <w:tcPr>
+            <w:tcW w:w="3515" w:type="dxa"/>
+          </w:tcPr>
+          <w:p>
+            <w:pPr>
+              <w:spacing w:before="40" w:after="40"/>
+            </w:pPr>
+            <w:r>
+              <w:rPr>
+                <w:sz w:val="19"/>
+              </w:rPr>
+              <w:t>Melayani rumah tangga, warung, toko dan mart, sekolah dan kantor, rumah kos, serta villa dan hotel.</w:t>
+            </w:r>
+          </w:p>
+        </w:tc>
+        <w:tc>
+          <w:tcPr>
+            <w:tcW w:w="3231" w:type="dxa"/>
+          </w:tcPr>
+          <w:p>
+            <w:pPr>
+              <w:spacing w:before="40" w:after="40"/>
+            </w:pPr>
+            <w:r>
+              <w:rPr>
+                <w:sz w:val="19"/>
+              </w:rPr>
+              <w:t>Pendaftaran pelanggan di Kantor BUM Desa Manik Sedana Kutuh, sebelah timur Wantian Rangdhu Kriya Mandala.</w:t>
+            </w:r>
+          </w:p>
+        </w:tc>
+      </w:tr>
+      <w:tr>
+        <w:trPr>
+          <w:jc w:val="center"/>
+        </w:trPr>
+        <w:tc>
+          <w:tcPr>
+            <w:tcW w:w="2041" w:type="dxa"/>
+          </w:tcPr>
+          <w:p>
+            <w:pPr>
+              <w:spacing w:before="40" w:after="40"/>
+            </w:pPr>
+            <w:r>
+              <w:rPr>
+                <w:sz w:val="19"/>
+              </w:rPr>
+              <w:t>Toko Grosir dan Ecer</w:t>
+            </w:r>
+          </w:p>
+        </w:tc>
+        <w:tc>
+          <w:tcPr>
+            <w:tcW w:w="3515" w:type="dxa"/>
+          </w:tcPr>
+          <w:p>
+            <w:pPr>
+              <w:spacing w:before="40" w:after="40"/>
+            </w:pPr>
+            <w:r>
+              <w:rPr>
+                <w:sz w:val="19"/>
+              </w:rPr>
+              <w:t>Menyediakan sembako dan keperluan harian rumah tangga, dengan layanan antar gratis di wilayah Desa Kutuh.</w:t>
+            </w:r>
+          </w:p>
+        </w:tc>
+        <w:tc>
+          <w:tcPr>
+            <w:tcW w:w="3231" w:type="dxa"/>
+          </w:tcPr>
+          <w:p>
+            <w:pPr>
+              <w:spacing w:before="40" w:after="40"/>
+            </w:pPr>
+            <w:r>
+              <w:rPr>
+                <w:sz w:val="19"/>
+              </w:rPr>
+              <w:t>Jalan Melang Kaja, Desa Kutuh. Buka setiap hari pukul 08.00 sampai 18.00 WITA.</w:t>
+            </w:r>
+          </w:p>
+        </w:tc>
+      </w:tr>
+      <w:tr>
+        <w:trPr>
+          <w:jc w:val="center"/>
+        </w:trPr>
+        <w:tc>
+          <w:tcPr>
+            <w:tcW w:w="2041" w:type="dxa"/>
+          </w:tcPr>
+          <w:p>
+            <w:pPr>
+              <w:spacing w:before="40" w:after="40"/>
+            </w:pPr>
+            <w:r>
+              <w:rPr>
+                <w:sz w:val="19"/>
+              </w:rPr>
+              <w:t>Pancali Spa</w:t>
+            </w:r>
+          </w:p>
+        </w:tc>
+        <w:tc>
+          <w:tcPr>
+            <w:tcW w:w="3515" w:type="dxa"/>
+          </w:tcPr>
+          <w:p>
+            <w:pPr>
+              <w:spacing w:before="40" w:after="40"/>
+            </w:pPr>
+            <w:r>
+              <w:rPr>
+                <w:sz w:val="19"/>
+              </w:rPr>
+              <w:t>Layanan spa bagi wisatawan dan warga, dikerjakan oleh tenaga kerja warga Desa Kutuh.</w:t>
+            </w:r>
+          </w:p>
+        </w:tc>
+        <w:tc>
+          <w:tcPr>
+            <w:tcW w:w="3231" w:type="dxa"/>
+          </w:tcPr>
+          <w:p>
+            <w:pPr>
+              <w:spacing w:before="40" w:after="40"/>
+            </w:pPr>
+            <w:r>
+              <w:rPr>
+                <w:sz w:val="19"/>
+              </w:rPr>
+              <w:t>Kawasan Pantai Pandawa. Buka setiap hari pukul 10.00 sampai 17.00 WITA.</w:t>
+            </w:r>
+          </w:p>
+        </w:tc>
+      </w:tr>
+    </w:tbl>
+    <w:p>
+      <w:pPr>
+        <w:spacing w:after="160"/>
+      </w:pPr>
+    </w:p>
+    <w:p>
+      <w:pPr>
         <w:pStyle w:val="Heading2"/>
       </w:pPr>
-      <w:bookmarkStart w:id="9" w:name="_Toc236052780"/>
+      <w:bookmarkStart w:id="9" w:name="_Toc236053787"/>
       <w:r>
         <w:rPr>
           <w:rFonts w:ascii="Aptos" w:hAnsi="Aptos"/>
         </w:rPr>
-        <w:t>D. Kepemimpinan Transformatif dan Budaya Antikorupsi</w:t>
+        <w:t>D. Tata Kelola Persampahan sebagai Konteks Pendukung</w:t>
       </w:r>
       <w:bookmarkEnd w:id="9"/>
+    </w:p>
+    <w:p>
+      <w:pPr>
+        <w:ind w:firstLine="425"/>
+        <w:jc w:val="both"/>
+      </w:pPr>
+      <w:r>
+        <w:t xml:space="preserve">Topik persampahan yang menjadi fokus Kelompok I bersinggungan langsung dengan salah satu unit usaha BUMDesa. Alur pengelolaannya berjalan dalam empat tahap, dimulai dari regulasi desa, edukasi di hulu bersama Satgas Sampah dan TP-PKK, pengangkutan </w:t>
+      </w:r>
+      <w:r>
+        <w:lastRenderedPageBreak/>
+        <w:t>terpilah oleh BUMDesa, hingga pengolahan di Tempat Pengolahan Sampah Terpadu Tebo Kauh. Inovasi pendukungnya berupa ekonomi sirkular Tebo Green Loop dan bank sampah Plastic Exchange yang dijalankan TP-PKK sejak 2022.</w:t>
+      </w:r>
+    </w:p>
+    <w:p>
+      <w:pPr>
+        <w:pStyle w:val="Heading2"/>
+      </w:pPr>
+      <w:bookmarkStart w:id="10" w:name="_Toc236053788"/>
+      <w:r>
+        <w:rPr>
+          <w:rFonts w:ascii="Aptos" w:hAnsi="Aptos"/>
+        </w:rPr>
+        <w:t>E. Kepemimpinan Transformatif dan Budaya Antikorupsi</w:t>
+      </w:r>
+      <w:bookmarkEnd w:id="10"/>
     </w:p>
     <w:p>
       <w:pPr>
@@ -4767,7 +5417,7 @@
       <w:pPr>
         <w:pStyle w:val="Heading1"/>
       </w:pPr>
-      <w:bookmarkStart w:id="10" w:name="_Toc236052781"/>
+      <w:bookmarkStart w:id="11" w:name="_Toc236053789"/>
       <w:r>
         <w:rPr>
           <w:rFonts w:ascii="Aptos" w:hAnsi="Aptos"/>
@@ -4775,7 +5425,7 @@
         <w:lastRenderedPageBreak/>
         <w:t>BAB III  LESSON LEARNT HASIL STUDI LAPANGAN</w:t>
       </w:r>
-      <w:bookmarkEnd w:id="10"/>
+      <w:bookmarkEnd w:id="11"/>
     </w:p>
     <w:p>
       <w:pPr>
@@ -5042,7 +5692,7 @@
       <w:pPr>
         <w:pStyle w:val="Heading1"/>
       </w:pPr>
-      <w:bookmarkStart w:id="11" w:name="_Toc236052782"/>
+      <w:bookmarkStart w:id="12" w:name="_Toc236053790"/>
       <w:r>
         <w:rPr>
           <w:rFonts w:ascii="Aptos" w:hAnsi="Aptos"/>
@@ -5050,7 +5700,7 @@
         <w:lastRenderedPageBreak/>
         <w:t>BAB IV  DIAGNOSA DAN IDE PENYELESAIAN</w:t>
       </w:r>
-      <w:bookmarkEnd w:id="11"/>
+      <w:bookmarkEnd w:id="12"/>
     </w:p>
     <w:p>
       <w:pPr>
@@ -5065,14 +5715,14 @@
       <w:pPr>
         <w:pStyle w:val="Heading2"/>
       </w:pPr>
-      <w:bookmarkStart w:id="12" w:name="_Toc236052783"/>
+      <w:bookmarkStart w:id="13" w:name="_Toc236053791"/>
       <w:r>
         <w:rPr>
           <w:rFonts w:ascii="Aptos" w:hAnsi="Aptos"/>
         </w:rPr>
         <w:t>A. Pemetaan Kesenjangan Kinerja</w:t>
       </w:r>
-      <w:bookmarkEnd w:id="12"/>
+      <w:bookmarkEnd w:id="13"/>
     </w:p>
     <w:p>
       <w:pPr>
@@ -5606,14 +6256,14 @@
       <w:pPr>
         <w:pStyle w:val="Heading2"/>
       </w:pPr>
-      <w:bookmarkStart w:id="13" w:name="_Toc236052784"/>
+      <w:bookmarkStart w:id="14" w:name="_Toc236053792"/>
       <w:r>
         <w:rPr>
           <w:rFonts w:ascii="Aptos" w:hAnsi="Aptos"/>
         </w:rPr>
         <w:t>B. Rumusan Ide Penyelesaian</w:t>
       </w:r>
-      <w:bookmarkEnd w:id="13"/>
+      <w:bookmarkEnd w:id="14"/>
     </w:p>
     <w:p>
       <w:pPr>
@@ -6292,14 +6942,14 @@
       <w:pPr>
         <w:pStyle w:val="Heading2"/>
       </w:pPr>
-      <w:bookmarkStart w:id="14" w:name="_Toc236052785"/>
+      <w:bookmarkStart w:id="15" w:name="_Toc236053793"/>
       <w:r>
         <w:rPr>
           <w:rFonts w:ascii="Aptos" w:hAnsi="Aptos"/>
         </w:rPr>
         <w:t>C. Prioritas Tindak Lanjut</w:t>
       </w:r>
-      <w:bookmarkEnd w:id="14"/>
+      <w:bookmarkEnd w:id="15"/>
     </w:p>
     <w:p>
       <w:pPr>
@@ -6331,7 +6981,7 @@
       <w:pPr>
         <w:pStyle w:val="Heading1"/>
       </w:pPr>
-      <w:bookmarkStart w:id="15" w:name="_Toc236052786"/>
+      <w:bookmarkStart w:id="16" w:name="_Toc236053794"/>
       <w:r>
         <w:rPr>
           <w:rFonts w:ascii="Aptos" w:hAnsi="Aptos"/>
@@ -6339,7 +6989,7 @@
         <w:lastRenderedPageBreak/>
         <w:t>BAB V  LAPORAN INDIVIDU</w:t>
       </w:r>
-      <w:bookmarkEnd w:id="15"/>
+      <w:bookmarkEnd w:id="16"/>
     </w:p>
     <w:p>
       <w:pPr>
@@ -6354,14 +7004,14 @@
       <w:pPr>
         <w:pStyle w:val="Heading2"/>
       </w:pPr>
-      <w:bookmarkStart w:id="16" w:name="_Toc236052787"/>
+      <w:bookmarkStart w:id="17" w:name="_Toc236053795"/>
       <w:r>
         <w:rPr>
           <w:rFonts w:ascii="Aptos" w:hAnsi="Aptos"/>
         </w:rPr>
         <w:t>A. Kerangka Laporan Individu</w:t>
       </w:r>
-      <w:bookmarkEnd w:id="16"/>
+      <w:bookmarkEnd w:id="17"/>
     </w:p>
     <w:tbl>
       <w:tblPr>
@@ -6766,14 +7416,14 @@
       <w:pPr>
         <w:pStyle w:val="Heading2"/>
       </w:pPr>
-      <w:bookmarkStart w:id="17" w:name="_Toc236052788"/>
+      <w:bookmarkStart w:id="18" w:name="_Toc236053796"/>
       <w:r>
         <w:rPr>
           <w:rFonts w:ascii="Aptos" w:hAnsi="Aptos"/>
         </w:rPr>
         <w:t>B. Daftar Penyusun Laporan Individu</w:t>
       </w:r>
-      <w:bookmarkEnd w:id="17"/>
+      <w:bookmarkEnd w:id="18"/>
     </w:p>
     <w:p>
       <w:pPr>
@@ -8029,7 +8679,7 @@
       <w:pPr>
         <w:pStyle w:val="Heading1"/>
       </w:pPr>
-      <w:bookmarkStart w:id="18" w:name="_Toc236052789"/>
+      <w:bookmarkStart w:id="19" w:name="_Toc236053797"/>
       <w:r>
         <w:rPr>
           <w:rFonts w:ascii="Aptos" w:hAnsi="Aptos"/>
@@ -8037,7 +8687,7 @@
         <w:lastRenderedPageBreak/>
         <w:t>PENUTUP</w:t>
       </w:r>
-      <w:bookmarkEnd w:id="18"/>
+      <w:bookmarkEnd w:id="19"/>
     </w:p>
     <w:p>
       <w:pPr>
@@ -8110,7 +8760,7 @@
       </w:r>
     </w:p>
     <w:sectPr>
-      <w:footerReference w:type="default" r:id="rId17"/>
+      <w:footerReference w:type="default" r:id="rId22"/>
       <w:pgSz w:w="11906" w:h="16838"/>
       <w:pgMar w:top="1417" w:right="1417" w:bottom="1417" w:left="1701" w:header="720" w:footer="720" w:gutter="0"/>
       <w:cols w:space="720"/>
@@ -8385,31 +9035,31 @@
       </w:rPr>
     </w:lvl>
   </w:abstractNum>
-  <w:num w:numId="1" w16cid:durableId="1269043174">
+  <w:num w:numId="1" w16cid:durableId="1424185396">
     <w:abstractNumId w:val="8"/>
   </w:num>
-  <w:num w:numId="2" w16cid:durableId="1451826130">
+  <w:num w:numId="2" w16cid:durableId="1714766368">
     <w:abstractNumId w:val="6"/>
   </w:num>
-  <w:num w:numId="3" w16cid:durableId="1441341025">
+  <w:num w:numId="3" w16cid:durableId="1699309183">
     <w:abstractNumId w:val="5"/>
   </w:num>
-  <w:num w:numId="4" w16cid:durableId="508910727">
+  <w:num w:numId="4" w16cid:durableId="1533614548">
     <w:abstractNumId w:val="4"/>
   </w:num>
-  <w:num w:numId="5" w16cid:durableId="463432622">
+  <w:num w:numId="5" w16cid:durableId="1399748951">
     <w:abstractNumId w:val="7"/>
   </w:num>
-  <w:num w:numId="6" w16cid:durableId="726951310">
+  <w:num w:numId="6" w16cid:durableId="504903920">
     <w:abstractNumId w:val="3"/>
   </w:num>
-  <w:num w:numId="7" w16cid:durableId="1860506487">
+  <w:num w:numId="7" w16cid:durableId="513308370">
     <w:abstractNumId w:val="2"/>
   </w:num>
-  <w:num w:numId="8" w16cid:durableId="1264876152">
+  <w:num w:numId="8" w16cid:durableId="986477650">
     <w:abstractNumId w:val="1"/>
   </w:num>
-  <w:num w:numId="9" w16cid:durableId="478961387">
+  <w:num w:numId="9" w16cid:durableId="1867212869">
     <w:abstractNumId w:val="0"/>
   </w:num>
 </w:numbering>
@@ -19800,7 +20450,7 @@
     <w:autoRedefine/>
     <w:uiPriority w:val="39"/>
     <w:unhideWhenUsed/>
-    <w:rsid w:val="00FC474D"/>
+    <w:rsid w:val="00465968"/>
     <w:pPr>
       <w:spacing w:after="100"/>
     </w:pPr>
@@ -19812,7 +20462,7 @@
     <w:autoRedefine/>
     <w:uiPriority w:val="39"/>
     <w:unhideWhenUsed/>
-    <w:rsid w:val="00FC474D"/>
+    <w:rsid w:val="00465968"/>
     <w:pPr>
       <w:spacing w:after="100"/>
       <w:ind w:left="220"/>
@@ -19823,7 +20473,7 @@
     <w:basedOn w:val="DefaultParagraphFont"/>
     <w:uiPriority w:val="99"/>
     <w:unhideWhenUsed/>
-    <w:rsid w:val="00FC474D"/>
+    <w:rsid w:val="00465968"/>
     <w:rPr>
       <w:color w:val="0000FF" w:themeColor="hyperlink"/>
       <w:u w:val="single"/>

</xml_diff>